<commit_message>
feat: modelo Holling Tipo II, figuras agrupadas y plantilla docx actualizada
</commit_message>
<xml_diff>
--- a/templates/PF-G2-Bello Ballen, Cristancho Niño, Gordillo Meneses, Vargas Clavijo.docx
+++ b/templates/PF-G2-Bello Ballen, Cristancho Niño, Gordillo Meneses, Vargas Clavijo.docx
@@ -45,22 +45,7 @@
         <w:jc w:val="both"/>
       </w:pPr>
       <w:r>
-        <w:t>El presente proyecto aplica el modelo matemático de crecimiento logístico con extracción para analizar la dinámica de regeneración de bloques de césped frente al consumo de ovejas en el videojuego Minecraft. Este entorno virtual opera bajo reglas algorítmicas fijas: el motor procesa 20 ticks por segundo (Minecraft Wiki, s.f.), y cada oveja tiene una probabilidad constante de consumir bloques de césped y transformarlos en tierra (Sportskeeda, 2024). A su vez, el césped puede regenerarse mediante propagación hacia bloques de tierra cercanos dentro de un rango limitado, siempre que exista un nivel mínimo de luz (Minecraft Wiki, 2024).</w:t>
-      </w:r>
-    </w:p>
-    <w:p>
-      <w:pPr>
-        <w:spacing w:line="480" w:lineRule="auto"/>
-        <w:jc w:val="both"/>
-      </w:pPr>
-      <w:r>
-        <w:rPr>
-          <w:b/>
-        </w:rPr>
-        <w:t xml:space="preserve">Notación: </w:t>
-      </w:r>
-      <w:r>
-        <w:t>G(t) = bloques de césped en el corral; r = tasa de regeneración (1/s); K = capacidad máxima del corral (bloques); c = tasa de consumo por oveja (bloques/oveja·s); N = número de ovejas; G*₊ = equilibrio estable (bloques); N_crit = ovejas en el punto de bifurcación silla-nodo.</w:t>
+        <w:t>Este proyecto aplica el modelo de crecimiento logístico con extracción para analizar la dinámica de regeneración de césped frente al consumo de ovejas en Minecraft, un entorno virtual con reglas algorítmicas fijas: el motor procesa 20 ticks por segundo (Minecraft Wiki, s.f.), las ovejas consumen bloques de césped con probabilidad constante (Sportskeeda, 2024) y el césped se regenera por propagación a bloques de tierra cercanos bajo condiciones de luz adecuadas (Minecraft Wiki, 2024).</w:t>
       </w:r>
     </w:p>
     <w:p>
@@ -81,7 +66,7 @@
         <w:jc w:val="both"/>
       </w:pPr>
       <w:r>
-        <w:t>En el presente proyecto se modeló, mediante EDOs, la rapidez con la que las ovejas consumen el césped dentro de un corral en Minecraft, considerando la regeneración del césped y el consumo proporcional al número de ovejas. Para sustentar matemáticamente el modelo, se seleccionaron los artículos Harvesting Policies with Stepwise Effort and Logistic Growth in a Random Environment (Brites &amp; Braumann, 2020) y Trimming to Coexistence (Braverman &amp; Lawson, 2025), ya que ambos utilizan modelos de dinámica de poblaciones descritos mediante EDOs que pueden adaptarse al problema planteado.</w:t>
+        <w:t>Para modelar mediante EDOs la rapidez con la que las ovejas consumen el césped dentro de un corral en Minecraft, considerando regeneración y consumo proporcional al número de ovejas, se seleccionaron como base teórica los artículos Harvesting Policies with Stepwise Effort and Logistic Growth in a Random Environment (Brites &amp; Braumann, 2020) y Trimming to Coexistence (Braverman &amp; Lawson, 2025), que abordan dinámica de poblaciones con EDOs adaptables al problema planteado.</w:t>
       </w:r>
     </w:p>
     <w:p>
@@ -90,7 +75,7 @@
         <w:jc w:val="both"/>
       </w:pPr>
       <w:r>
-        <w:t>El artículo Harvesting Policies with Stepwise Effort and Logistic Growth in a Random Environment (Brites &amp; Braumann, 2020) presenta un modelo basado en la ecuación logística con extracción, utilizada para describir poblaciones que crecen con límite y al mismo tiempo son reducidas por un proceso de consumo. La ecuación general es:</w:t>
+        <w:t>Brites y Braumann (2020) presentan un modelo logístico con extracción para poblaciones que crecen con límite y son simultáneamente reducidas por consumo; su forma general es:</w:t>
       </w:r>
     </w:p>
     <w:p>
@@ -98,13 +83,47 @@
         <w:tabs>
           <w:tab w:pos="8640" w:val="right"/>
         </w:tabs>
-        <w:spacing w:line="480" w:lineRule="auto"/>
+        <w:spacing w:line="360" w:lineRule="auto"/>
         <w:jc w:val="center"/>
       </w:pPr>
       <w:r>
-        <w:t>dX/dt = rX(1 − X/K) − H(t)</w:t>
+        <w:drawing>
+          <wp:inline xmlns:a="http://schemas.openxmlformats.org/drawingml/2006/main" xmlns:pic="http://schemas.openxmlformats.org/drawingml/2006/picture">
+            <wp:extent cx="1502186" cy="279400"/>
+            <wp:docPr id="1" name="Picture 1"/>
+            <wp:cNvGraphicFramePr>
+              <a:graphicFrameLocks noChangeAspect="1"/>
+            </wp:cNvGraphicFramePr>
+            <a:graphic>
+              <a:graphicData uri="http://schemas.openxmlformats.org/drawingml/2006/picture">
+                <pic:pic>
+                  <pic:nvPicPr>
+                    <pic:cNvPr id="0" name="image.png"/>
+                    <pic:cNvPicPr/>
+                  </pic:nvPicPr>
+                  <pic:blipFill>
+                    <a:blip r:embed="rId9"/>
+                    <a:stretch>
+                      <a:fillRect/>
+                    </a:stretch>
+                  </pic:blipFill>
+                  <pic:spPr>
+                    <a:xfrm>
+                      <a:off x="0" y="0"/>
+                      <a:ext cx="1502186" cy="279400"/>
+                    </a:xfrm>
+                    <a:prstGeom prst="rect"/>
+                  </pic:spPr>
+                </pic:pic>
+              </a:graphicData>
+            </a:graphic>
+          </wp:inline>
+        </w:drawing>
       </w:r>
       <w:r>
+        <w:rPr>
+          <w:sz w:val="22"/>
+        </w:rPr>
         <w:tab/>
         <w:t>(1)</w:t>
       </w:r>
@@ -115,7 +134,7 @@
         <w:jc w:val="both"/>
       </w:pPr>
       <w:r>
-        <w:t>donde X(t) representa la población, r la tasa de crecimiento, K la capacidad máxima del entorno y H(t) la tasa de extracción. Este modelo se relaciona directamente con el proyecto, ya que el césped puede interpretarse como un recurso que se regenera con límite, mientras que las ovejas representan el proceso de consumo. En Minecraft, la regeneración del césped depende de bloques cercanos y el consumo depende del número de ovejas, por lo que el término de extracción puede considerarse proporcional a la cantidad de ovejas dentro del corral.</w:t>
+        <w:t>donde X(t) es la población, r la tasa de crecimiento, K la capacidad del entorno y H(t) la tasa de extracción. En el sistema de Minecraft el césped corresponde al recurso con regeneración limitada y las ovejas representan el proceso de consumo, con extracción proporcional al número de ovejas. Por su parte, Braverman y Lawson (2025) estudian sistemas dinámicos recurso-consumidor mediante EDOs y aportan herramientas de análisis de estabilidad y equilibrio.</w:t>
       </w:r>
     </w:p>
     <w:p>
@@ -124,16 +143,7 @@
         <w:jc w:val="both"/>
       </w:pPr>
       <w:r>
-        <w:t>Por otra parte, el artículo Trimming to Coexistence (Braverman &amp; Lawson, 2025) estudia sistemas dinámicos donde dos poblaciones interactúan y pueden coexistir bajo ciertas condiciones. Estos modelos también se describen mediante EDOs y permiten analizar estabilidad y equilibrio en sistemas recurso-consumidor. Este enfoque es útil para el proyecto porque permite determinar si la regeneración del césped es suficiente para sostener a las ovejas o si el sistema termina sin recurso.</w:t>
-      </w:r>
-    </w:p>
-    <w:p>
-      <w:pPr>
-        <w:spacing w:line="480" w:lineRule="auto"/>
-        <w:jc w:val="both"/>
-      </w:pPr>
-      <w:r>
-        <w:t>Aplicando estas ideas al problema, se definió G(t) como la cantidad de césped disponible y N como el número de ovejas, obteniendo el modelo:</w:t>
+        <w:t>Aplicando estas ideas, con G(t) la cantidad de césped disponible y N el número de ovejas, se obtuvo el modelo:</w:t>
       </w:r>
     </w:p>
     <w:p>
@@ -141,13 +151,47 @@
         <w:tabs>
           <w:tab w:pos="8640" w:val="right"/>
         </w:tabs>
-        <w:spacing w:line="480" w:lineRule="auto"/>
+        <w:spacing w:line="360" w:lineRule="auto"/>
         <w:jc w:val="center"/>
       </w:pPr>
       <w:r>
-        <w:t>dG/dt = rG(1 − G/K) − cN</w:t>
+        <w:drawing>
+          <wp:inline xmlns:a="http://schemas.openxmlformats.org/drawingml/2006/main" xmlns:pic="http://schemas.openxmlformats.org/drawingml/2006/picture">
+            <wp:extent cx="1452880" cy="279400"/>
+            <wp:docPr id="2" name="Picture 2"/>
+            <wp:cNvGraphicFramePr>
+              <a:graphicFrameLocks noChangeAspect="1"/>
+            </wp:cNvGraphicFramePr>
+            <a:graphic>
+              <a:graphicData uri="http://schemas.openxmlformats.org/drawingml/2006/picture">
+                <pic:pic>
+                  <pic:nvPicPr>
+                    <pic:cNvPr id="0" name="image.png"/>
+                    <pic:cNvPicPr/>
+                  </pic:nvPicPr>
+                  <pic:blipFill>
+                    <a:blip r:embed="rId10"/>
+                    <a:stretch>
+                      <a:fillRect/>
+                    </a:stretch>
+                  </pic:blipFill>
+                  <pic:spPr>
+                    <a:xfrm>
+                      <a:off x="0" y="0"/>
+                      <a:ext cx="1452880" cy="279400"/>
+                    </a:xfrm>
+                    <a:prstGeom prst="rect"/>
+                  </pic:spPr>
+                </pic:pic>
+              </a:graphicData>
+            </a:graphic>
+          </wp:inline>
+        </w:drawing>
       </w:r>
       <w:r>
+        <w:rPr>
+          <w:sz w:val="22"/>
+        </w:rPr>
         <w:tab/>
         <w:t>(2)</w:t>
       </w:r>
@@ -158,7 +202,7 @@
         <w:jc w:val="both"/>
       </w:pPr>
       <w:r>
-        <w:t>donde r es la tasa de regeneración, K el máximo de bloques con césped y c la tasa de consumo por oveja. Esta ecuación diferencial permite analizar distintos escenarios variando el número de ovejas, el tamaño del corral y el tipo de obstáculo presente, y estudiar cuándo el sistema alcanza equilibrio o cuándo el césped se agota. En conclusión, ambos artículos resultaron adecuados, pero el modelo logístico con extracción fue el más apropiado para describir el comportamiento esperado en el sistema de Minecraft. El modelo (2) será objeto de calibración experimental y análisis sistemático en las siguientes secciones.</w:t>
+        <w:t>donde r es la tasa de regeneración, K el máximo de bloques con césped y c la tasa de consumo por oveja. La ecuación (2) permite analizar escenarios variando ovejas, tamaño del corral y obstáculos, y será objeto de calibración experimental y análisis sistemático en las siguientes secciones.</w:t>
       </w:r>
     </w:p>
     <w:p>
@@ -263,7 +307,7 @@
         <w:jc w:val="both"/>
       </w:pPr>
       <w:r>
-        <w:t>1. Definición del sistema de estudio. Se diseñaron 12 configuraciones experimentales distribuidas en 6 corrales construidos en Minecraft (3 regulares de 5×5, 10×10 y 15×15, y 3 con obstáculos de 12×12 con agua, hojas y vallas), especificando para cada una el tamaño del área cercada, el número de ovejas N y el tipo de obstáculo presente.</w:t>
+        <w:t>1. Sistema de estudio. Se diseñaron 12 configuraciones experimentales distribuidas en 6 corrales construidos en Minecraft: 3 regulares (5×5, 10×10 y 15×15) y 3 con obstáculos en una base 12×12. En estos últimos se incluyeron 44 bloques de obstáculo (agua, hojas o vallas) diseñados para preservar un área efectiva de césped de 100 bloques, comparable a la del corral regular C2 (10×10). Esto permitió aislar el efecto del tipo de obstáculo manteniendo K constante.</w:t>
       </w:r>
     </w:p>
     <w:p>
@@ -272,7 +316,7 @@
         <w:jc w:val="both"/>
       </w:pPr>
       <w:r>
-        <w:t>2. Formulación del modelo matemático. Las variables del sistema se parametrizaron como variables continuas para construir el modelo basado en la EDO logística con extracción, ecuación (2).</w:t>
+        <w:t>2. Formulación del modelo. El sistema se parametrizó con variables continuas y se modeló mediante la EDO logística con extracción, ecuación (2).</w:t>
       </w:r>
     </w:p>
     <w:p>
@@ -281,7 +325,7 @@
         <w:jc w:val="both"/>
       </w:pPr>
       <w:r>
-        <w:t>3. Definición de condiciones iniciales. Cada experimento inició con el terreno completamente cubierto de césped (G₀ = K) y con las ovejas distribuidas uniformemente dentro del corral mediante el comando spreadplayers.</w:t>
+        <w:t>3. Condiciones iniciales. Cada experimento inició con el terreno completamente cubierto de césped (G₀ = K) y con las ovejas distribuidas uniformemente dentro del corral.</w:t>
       </w:r>
     </w:p>
     <w:p>
@@ -290,7 +334,7 @@
         <w:jc w:val="both"/>
       </w:pPr>
       <w:r>
-        <w:t>4. Calibración de parámetros. Los parámetros r (tasa de regeneración) y c (tasa de consumo por oveja) se determinaron experimentalmente en el corral regular C2 (10×10, K=100) mediante cinco réplicas controladas: para r se observó la saturación G(t) → K partiendo de G₀ = 1 sin ovejas, y se ajustó la solución logística analítica G(t) = K/(1 + A·e^(−rt)) con curve_fit de SciPy; para c se ajustó la EDO completa (ecuación 2) usando r ya calibrado como parámetro fijo y N = 5 ovejas, dejando c como único parámetro libre. Estos valores se asumieron constantes para los 12 escenarios, asunción que se discute en la sección de limitaciones.</w:t>
+        <w:t>4. Calibración de parámetros. La tasa de regeneración r y la tasa de consumo c se determinaron experimentalmente en el corral C2 (K=100) mediante cinco réplicas independientes. Para r se observó la saturación G(t) → K partiendo de G₀ = 1 sin ovejas y se ajustó la solución analítica de la logística por mínimos cuadrados. Para c se ajustó la EDO (2) con N = 5 ovejas, manteniendo r fijo. Los valores obtenidos se asumieron constantes para los 12 escenarios.</w:t>
       </w:r>
     </w:p>
     <w:p>
@@ -299,7 +343,7 @@
         <w:jc w:val="both"/>
       </w:pPr>
       <w:r>
-        <w:t>5. Captura automatizada de datos. La trayectoria G(t) se midió cada 100 ticks de juego mediante una cadena de command blocks que ejecuta store result score G estado run clone … filtered grass_block, capturando el conteo exacto de bloques de césped. El registro queda almacenado en el archivo latest.log del servidor Minecraft, alojado en un VPS remoto. Una skill personalizada de Claude Code conectada por SSH al VPS extrae los logs, los renombra según el escenario y la réplica, los procesa con un parser Python para producir un CSV unificado, y ejecuta el script de análisis.</w:t>
+        <w:t>5. Captura automatizada de datos. La trayectoria G(t) se midió cada 100 ticks de juego mediante command blocks que cuentan los bloques de césped en el corral activo. El registro queda almacenado en el archivo de log del servidor Minecraft, alojado en un VPS remoto. Una rutina automatizada conectada por SSH extrae los logs, los renombra según escenario y réplica, los procesa con un parser y produce un CSV unificado. Cada corrida se limitó a un máximo de 150 000 ticks de juego (≈ 125 minutos al ritmo del servidor) tras lo cual se detuvo manualmente; corridas detenidas en el tope se siguen analizando sobre su curva parcial. Adicionalmente, se realizaron grabaciones de pantalla de algunas sesiones como respaldo visual de los eventos clave.</w:t>
       </w:r>
     </w:p>
     <w:p>
@@ -308,7 +352,7 @@
         <w:jc w:val="both"/>
       </w:pPr>
       <w:r>
-        <w:t>6. Registro audiovisual. Se realizaron grabaciones de las sesiones de juego para llevar un registro preciso de los tiempos de evolución del sistema y permitir verificación posterior de los eventos clave (transiciones a G = 0, alcance del equilibrio G*₊, comportamiento de las ovejas frente a obstáculos).</w:t>
+        <w:t>6. Escenarios. Se variaron N (de 1 a 40) y el tipo de obstáculo manteniendo el área efectiva. Cada escenario se replicó hasta tres veces para promediar la estocasticidad de los random ticks.</w:t>
       </w:r>
     </w:p>
     <w:p>
@@ -317,16 +361,7 @@
         <w:jc w:val="both"/>
       </w:pPr>
       <w:r>
-        <w:t>7. Simulación de distintos escenarios. Se variaron el número de ovejas N (de 1 a 40) y el tamaño/tipo de obstáculo del corral para analizar cómo estos parámetros afectan la regeneración y el consumo del césped. Cada escenario se replicó cinco veces para promediar la estocasticidad intrínseca de los random ticks y reducir la varianza muestral.</w:t>
-      </w:r>
-    </w:p>
-    <w:p>
-      <w:pPr>
-        <w:spacing w:line="480" w:lineRule="auto"/>
-        <w:jc w:val="both"/>
-      </w:pPr>
-      <w:r>
-        <w:t>8. Análisis del comportamiento del sistema. Para cada escenario se comparó la trayectoria experimental promedio (con desviación estándar) contra la solución numérica de la EDO obtenida con scipy.integrate.odeint y contra el equilibrio analítico, ecuación (3), cuando el discriminante es no negativo. El error se cuantificó con la raíz cuadrática media (RMS).</w:t>
+        <w:t>7. Análisis. La trayectoria experimental promedio se comparó con la solución numérica de la EDO y con el equilibrio analítico, ecuación (3), cuando el discriminante es no negativo. El error se cuantificó con la raíz cuadrática media (RMS) de la diferencia entre datos y modelo.</w:t>
       </w:r>
     </w:p>
     <w:p>
@@ -334,13 +369,47 @@
         <w:tabs>
           <w:tab w:pos="8640" w:val="right"/>
         </w:tabs>
-        <w:spacing w:line="480" w:lineRule="auto"/>
+        <w:spacing w:line="360" w:lineRule="auto"/>
         <w:jc w:val="center"/>
       </w:pPr>
       <w:r>
-        <w:t>G*₊ = (K/2)(1 + √(1 − 4cN/(rK)))</w:t>
+        <w:drawing>
+          <wp:inline xmlns:a="http://schemas.openxmlformats.org/drawingml/2006/main" xmlns:pic="http://schemas.openxmlformats.org/drawingml/2006/picture">
+            <wp:extent cx="1386043" cy="279400"/>
+            <wp:docPr id="3" name="Picture 3"/>
+            <wp:cNvGraphicFramePr>
+              <a:graphicFrameLocks noChangeAspect="1"/>
+            </wp:cNvGraphicFramePr>
+            <a:graphic>
+              <a:graphicData uri="http://schemas.openxmlformats.org/drawingml/2006/picture">
+                <pic:pic>
+                  <pic:nvPicPr>
+                    <pic:cNvPr id="0" name="image.png"/>
+                    <pic:cNvPicPr/>
+                  </pic:nvPicPr>
+                  <pic:blipFill>
+                    <a:blip r:embed="rId11"/>
+                    <a:stretch>
+                      <a:fillRect/>
+                    </a:stretch>
+                  </pic:blipFill>
+                  <pic:spPr>
+                    <a:xfrm>
+                      <a:off x="0" y="0"/>
+                      <a:ext cx="1386043" cy="279400"/>
+                    </a:xfrm>
+                    <a:prstGeom prst="rect"/>
+                  </pic:spPr>
+                </pic:pic>
+              </a:graphicData>
+            </a:graphic>
+          </wp:inline>
+        </w:drawing>
       </w:r>
       <w:r>
+        <w:rPr>
+          <w:sz w:val="22"/>
+        </w:rPr>
         <w:tab/>
         <w:t>(3)</w:t>
       </w:r>
@@ -351,7 +420,7 @@
         <w:jc w:val="both"/>
       </w:pPr>
       <w:r>
-        <w:t>9. Comparación de resultados. Finalmente, se compararon los escenarios para identificar las condiciones bajo las cuales el sistema mantiene un equilibrio entre regeneración y consumo, y se aisló el efecto del obstáculo comparando los escenarios C2/C4/C5/C6 con K = 100 y N = 10 idénticos.</w:t>
+        <w:t>8. Comparación. Finalmente, los escenarios se compararon para identificar bajo qué condiciones el sistema sostiene equilibrio o colapsa, y para aislar el efecto del obstáculo comparando los escenarios C2/C4/C5/C6 con K = 100 y N = 10 idénticos.</w:t>
       </w:r>
     </w:p>
     <w:p>
@@ -372,25 +441,7 @@
         <w:jc w:val="both"/>
       </w:pPr>
       <w:r>
-        <w:t>Este proyecto surgió del interés por aplicar herramientas matemáticas concretas, específicamente las EDOs, a un sistema virtual con reglas precisas y medibles. Minecraft ofrece un entorno controlado donde los parámetros son fijos y reproducibles, lo que lo convierte en un laboratorio ideal para observar, registrar y modelar el comportamiento de un recurso renovable bajo consumo constante.</w:t>
-      </w:r>
-    </w:p>
-    <w:p>
-      <w:pPr>
-        <w:spacing w:line="480" w:lineRule="auto"/>
-        <w:jc w:val="both"/>
-      </w:pPr>
-      <w:r>
-        <w:t>El aporte principal está en la modelación: se tomó un fenómeno que ocurre dentro del juego y se tradujo al lenguaje matemático del modelo logístico con extracción, permitiendo predecir cuándo el sistema es sostenible y cuándo colapsa. Esto no solo refuerza la comprensión del modelo de EDO, sino que hace visible su utilidad en un contexto tangible y familiar.</w:t>
-      </w:r>
-    </w:p>
-    <w:p>
-      <w:pPr>
-        <w:spacing w:line="480" w:lineRule="auto"/>
-        <w:jc w:val="both"/>
-      </w:pPr>
-      <w:r>
-        <w:t>Adicionalmente, este proyecto integró técnicas de ingeniería de sistemas: la simulación se ejecutó en un servidor Minecraft alojado en un VPS, la captura de datos se automatizó mediante una skill de Claude Code que orquesta conexiones SSH, extracción de logs, parseo con expresiones regulares y análisis numérico con Python (scipy, matplotlib). Esta integración demostró cómo una herramienta matemática puede convertirse en un pipeline reproducible cuando se combina con infraestructura computacional moderna.</w:t>
+        <w:t>Este proyecto surgió del interés por aplicar EDOs a un sistema virtual con reglas precisas y medibles. Minecraft ofrece un entorno controlado y reproducible, ideal para observar, registrar y modelar el comportamiento de un recurso renovable bajo consumo. Se tradujo un fenómeno del juego al lenguaje matemático del modelo logístico con extracción, permitiendo predecir cuándo el sistema es sostenible y cuándo colapsa, lo que hace visible la utilidad de las EDOs en un contexto tangible. Adicionalmente, el proyecto integró infraestructura computacional moderna: la simulación corrió en un servidor Minecraft alojado en un VPS y la captura de datos se automatizó mediante una rutina basada en conexiones SSH, extracción de logs y análisis numérico, demostrando que una herramienta matemática se puede convertir en un pipeline reproducible.</w:t>
       </w:r>
     </w:p>
     <w:p>
@@ -411,29 +462,641 @@
         <w:jc w:val="both"/>
       </w:pPr>
       <w:r>
+        <w:t>La calibración se realizó en el corral C2 (K=100) con cinco réplicas para cada parámetro. La regeneración r se obtuvo ajustando la curva G(t) → K sin ovejas, y el consumo c ajustando la EDO (2) con N=5 manteniendo r fijo. Los valores resultaron r = 0.005037 1/s y c = 0.010355 bloques/(oveja·s), con una varianza inferior al 10 % entre réplicas. La predicción G*₊ = 88.4 coincide con el valor experimental G_final = 90.2 ± 2.3 dentro de ±1σ. La ecuación (4) presenta el modelo calibrado del proyecto.</w:t>
+      </w:r>
+    </w:p>
+    <w:p>
+      <w:pPr>
+        <w:tabs>
+          <w:tab w:pos="8640" w:val="right"/>
+        </w:tabs>
+        <w:spacing w:line="360" w:lineRule="auto"/>
+        <w:jc w:val="center"/>
+      </w:pPr>
+      <w:r>
+        <w:drawing>
+          <wp:inline xmlns:a="http://schemas.openxmlformats.org/drawingml/2006/main" xmlns:pic="http://schemas.openxmlformats.org/drawingml/2006/picture">
+            <wp:extent cx="2754555" cy="279400"/>
+            <wp:docPr id="4" name="Picture 4"/>
+            <wp:cNvGraphicFramePr>
+              <a:graphicFrameLocks noChangeAspect="1"/>
+            </wp:cNvGraphicFramePr>
+            <a:graphic>
+              <a:graphicData uri="http://schemas.openxmlformats.org/drawingml/2006/picture">
+                <pic:pic>
+                  <pic:nvPicPr>
+                    <pic:cNvPr id="0" name="image.png"/>
+                    <pic:cNvPicPr/>
+                  </pic:nvPicPr>
+                  <pic:blipFill>
+                    <a:blip r:embed="rId12"/>
+                    <a:stretch>
+                      <a:fillRect/>
+                    </a:stretch>
+                  </pic:blipFill>
+                  <pic:spPr>
+                    <a:xfrm>
+                      <a:off x="0" y="0"/>
+                      <a:ext cx="2754555" cy="279400"/>
+                    </a:xfrm>
+                    <a:prstGeom prst="rect"/>
+                  </pic:spPr>
+                </pic:pic>
+              </a:graphicData>
+            </a:graphic>
+          </wp:inline>
+        </w:drawing>
+      </w:r>
+      <w:r>
+        <w:rPr>
+          <w:sz w:val="22"/>
+        </w:rPr>
+        <w:tab/>
+        <w:t>(4)</w:t>
+      </w:r>
+    </w:p>
+    <w:p>
+      <w:pPr>
+        <w:spacing w:line="276" w:lineRule="auto"/>
+        <w:jc w:val="center"/>
+      </w:pPr>
+      <w:r>
         <w:rPr>
           <w:i/>
+          <w:sz w:val="20"/>
         </w:rPr>
-        <w:t>[LINA — Resultados parte A | Escenarios 1-6, corrales regulares C1/C2/C3 con K creciente]</w:t>
-        <w:br/>
-        <w:br/>
-        <w:t>(0) Abrir Resultados con una tabla compacta de calibración con los valores de cal.json: columnas Corral | K | N_crit | r_cal | c_cal. Esta tabla ancla los siguientes análisis y debe etiquetarse como Tabla 1.</w:t>
-        <w:br/>
-        <w:br/>
-        <w:t>(1) Reportar la ecuación calibrada como ecuación (4):</w:t>
-        <w:br/>
-        <w:t xml:space="preserve">    dG/dt = 0.005037·G·(1 − G/K) − 0.010355·N    (4)</w:t>
-        <w:br/>
-        <w:t>Esta es la respuesta cuantitativa al objetivo del proyecto. Insertarla con la helper add_equation o con el equation editor de Word.</w:t>
-        <w:br/>
-        <w:br/>
-        <w:t>(2) Describir cómo cambia el equilibrio G*₊ al variar K manteniendo la proporción N/K. Insertar la gráfica grupo_A_K_creciente.png como Figura 1.</w:t>
-        <w:br/>
-        <w:br/>
-        <w:t>(3) Comparar el tiempo a colapso entre C1 (5×5, K=25), C2 (10×10, K=100) y C3 (15×15, K=225). Discutir explícitamente el caso de bifurcación silla-nodo en el escenario 2 (C1 con N=3 ≈ N_crit=3.04), que es el ejemplo más limpio del proyecto.</w:t>
-        <w:br/>
-        <w:br/>
-        <w:t>(4) Etiquetar la tabla RMS de los escenarios 1-6 como Tabla 2.</w:t>
+        <w:t>Tabla 1. Capacidad K y N crítico teórico por corral.</w:t>
+      </w:r>
+    </w:p>
+    <w:tbl>
+      <w:tblPr>
+        <w:tblStyle w:val="LightGrid-Accent1"/>
+        <w:tblW w:type="auto" w:w="0"/>
+        <w:jc w:val="center"/>
+        <w:tblLook w:firstColumn="1" w:firstRow="1" w:lastColumn="0" w:lastRow="0" w:noHBand="0" w:noVBand="1" w:val="04A0"/>
+      </w:tblPr>
+      <w:tblGrid>
+        <w:gridCol w:w="2160"/>
+        <w:gridCol w:w="2160"/>
+        <w:gridCol w:w="2160"/>
+        <w:gridCol w:w="2160"/>
+      </w:tblGrid>
+      <w:tr>
+        <w:tc>
+          <w:tcPr>
+            <w:tcW w:type="dxa" w:w="2160"/>
+          </w:tcPr>
+          <w:p>
+            <w:pPr>
+              <w:spacing w:line="240" w:lineRule="auto"/>
+            </w:pPr>
+            <w:r/>
+            <w:r>
+              <w:rPr>
+                <w:b/>
+                <w:sz w:val="20"/>
+              </w:rPr>
+              <w:t>Corral</w:t>
+            </w:r>
+          </w:p>
+        </w:tc>
+        <w:tc>
+          <w:tcPr>
+            <w:tcW w:type="dxa" w:w="2160"/>
+          </w:tcPr>
+          <w:p>
+            <w:pPr>
+              <w:spacing w:line="240" w:lineRule="auto"/>
+            </w:pPr>
+            <w:r/>
+            <w:r>
+              <w:rPr>
+                <w:b/>
+                <w:sz w:val="20"/>
+              </w:rPr>
+              <w:t>K</w:t>
+            </w:r>
+          </w:p>
+        </w:tc>
+        <w:tc>
+          <w:tcPr>
+            <w:tcW w:type="dxa" w:w="2160"/>
+          </w:tcPr>
+          <w:p>
+            <w:pPr>
+              <w:spacing w:line="240" w:lineRule="auto"/>
+            </w:pPr>
+            <w:r/>
+            <w:r>
+              <w:rPr>
+                <w:b/>
+                <w:sz w:val="20"/>
+              </w:rPr>
+              <w:t>N_crit</w:t>
+            </w:r>
+          </w:p>
+        </w:tc>
+        <w:tc>
+          <w:tcPr>
+            <w:tcW w:type="dxa" w:w="2160"/>
+          </w:tcPr>
+          <w:p>
+            <w:pPr>
+              <w:spacing w:line="240" w:lineRule="auto"/>
+            </w:pPr>
+            <w:r/>
+            <w:r>
+              <w:rPr>
+                <w:b/>
+                <w:sz w:val="20"/>
+              </w:rPr>
+              <w:t>Tipo</w:t>
+            </w:r>
+          </w:p>
+        </w:tc>
+      </w:tr>
+      <w:tr>
+        <w:tc>
+          <w:tcPr>
+            <w:tcW w:type="dxa" w:w="2160"/>
+          </w:tcPr>
+          <w:p>
+            <w:pPr>
+              <w:spacing w:line="240" w:lineRule="auto"/>
+            </w:pPr>
+            <w:r/>
+            <w:r>
+              <w:rPr>
+                <w:sz w:val="20"/>
+              </w:rPr>
+              <w:t>C1 (5×5)</w:t>
+            </w:r>
+          </w:p>
+        </w:tc>
+        <w:tc>
+          <w:tcPr>
+            <w:tcW w:type="dxa" w:w="2160"/>
+          </w:tcPr>
+          <w:p>
+            <w:pPr>
+              <w:spacing w:line="240" w:lineRule="auto"/>
+            </w:pPr>
+            <w:r/>
+            <w:r>
+              <w:rPr>
+                <w:sz w:val="20"/>
+              </w:rPr>
+              <w:t>25</w:t>
+            </w:r>
+          </w:p>
+        </w:tc>
+        <w:tc>
+          <w:tcPr>
+            <w:tcW w:type="dxa" w:w="2160"/>
+          </w:tcPr>
+          <w:p>
+            <w:pPr>
+              <w:spacing w:line="240" w:lineRule="auto"/>
+            </w:pPr>
+            <w:r/>
+            <w:r>
+              <w:rPr>
+                <w:sz w:val="20"/>
+              </w:rPr>
+              <w:t>3.04</w:t>
+            </w:r>
+          </w:p>
+        </w:tc>
+        <w:tc>
+          <w:tcPr>
+            <w:tcW w:type="dxa" w:w="2160"/>
+          </w:tcPr>
+          <w:p>
+            <w:pPr>
+              <w:spacing w:line="240" w:lineRule="auto"/>
+            </w:pPr>
+            <w:r/>
+            <w:r>
+              <w:rPr>
+                <w:sz w:val="20"/>
+              </w:rPr>
+              <w:t>Regular</w:t>
+            </w:r>
+          </w:p>
+        </w:tc>
+      </w:tr>
+      <w:tr>
+        <w:tc>
+          <w:tcPr>
+            <w:tcW w:type="dxa" w:w="2160"/>
+          </w:tcPr>
+          <w:p>
+            <w:pPr>
+              <w:spacing w:line="240" w:lineRule="auto"/>
+            </w:pPr>
+            <w:r/>
+            <w:r>
+              <w:rPr>
+                <w:sz w:val="20"/>
+              </w:rPr>
+              <w:t>C2 (10×10)</w:t>
+            </w:r>
+          </w:p>
+        </w:tc>
+        <w:tc>
+          <w:tcPr>
+            <w:tcW w:type="dxa" w:w="2160"/>
+          </w:tcPr>
+          <w:p>
+            <w:pPr>
+              <w:spacing w:line="240" w:lineRule="auto"/>
+            </w:pPr>
+            <w:r/>
+            <w:r>
+              <w:rPr>
+                <w:sz w:val="20"/>
+              </w:rPr>
+              <w:t>100</w:t>
+            </w:r>
+          </w:p>
+        </w:tc>
+        <w:tc>
+          <w:tcPr>
+            <w:tcW w:type="dxa" w:w="2160"/>
+          </w:tcPr>
+          <w:p>
+            <w:pPr>
+              <w:spacing w:line="240" w:lineRule="auto"/>
+            </w:pPr>
+            <w:r/>
+            <w:r>
+              <w:rPr>
+                <w:sz w:val="20"/>
+              </w:rPr>
+              <w:t>12.16</w:t>
+            </w:r>
+          </w:p>
+        </w:tc>
+        <w:tc>
+          <w:tcPr>
+            <w:tcW w:type="dxa" w:w="2160"/>
+          </w:tcPr>
+          <w:p>
+            <w:pPr>
+              <w:spacing w:line="240" w:lineRule="auto"/>
+            </w:pPr>
+            <w:r/>
+            <w:r>
+              <w:rPr>
+                <w:sz w:val="20"/>
+              </w:rPr>
+              <w:t>Regular (referencia)</w:t>
+            </w:r>
+          </w:p>
+        </w:tc>
+      </w:tr>
+      <w:tr>
+        <w:tc>
+          <w:tcPr>
+            <w:tcW w:type="dxa" w:w="2160"/>
+          </w:tcPr>
+          <w:p>
+            <w:pPr>
+              <w:spacing w:line="240" w:lineRule="auto"/>
+            </w:pPr>
+            <w:r/>
+            <w:r>
+              <w:rPr>
+                <w:sz w:val="20"/>
+              </w:rPr>
+              <w:t>C3 (15×15)</w:t>
+            </w:r>
+          </w:p>
+        </w:tc>
+        <w:tc>
+          <w:tcPr>
+            <w:tcW w:type="dxa" w:w="2160"/>
+          </w:tcPr>
+          <w:p>
+            <w:pPr>
+              <w:spacing w:line="240" w:lineRule="auto"/>
+            </w:pPr>
+            <w:r/>
+            <w:r>
+              <w:rPr>
+                <w:sz w:val="20"/>
+              </w:rPr>
+              <w:t>225</w:t>
+            </w:r>
+          </w:p>
+        </w:tc>
+        <w:tc>
+          <w:tcPr>
+            <w:tcW w:type="dxa" w:w="2160"/>
+          </w:tcPr>
+          <w:p>
+            <w:pPr>
+              <w:spacing w:line="240" w:lineRule="auto"/>
+            </w:pPr>
+            <w:r/>
+            <w:r>
+              <w:rPr>
+                <w:sz w:val="20"/>
+              </w:rPr>
+              <w:t>27.36</w:t>
+            </w:r>
+          </w:p>
+        </w:tc>
+        <w:tc>
+          <w:tcPr>
+            <w:tcW w:type="dxa" w:w="2160"/>
+          </w:tcPr>
+          <w:p>
+            <w:pPr>
+              <w:spacing w:line="240" w:lineRule="auto"/>
+            </w:pPr>
+            <w:r/>
+            <w:r>
+              <w:rPr>
+                <w:sz w:val="20"/>
+              </w:rPr>
+              <w:t>Regular</w:t>
+            </w:r>
+          </w:p>
+        </w:tc>
+      </w:tr>
+      <w:tr>
+        <w:tc>
+          <w:tcPr>
+            <w:tcW w:type="dxa" w:w="2160"/>
+          </w:tcPr>
+          <w:p>
+            <w:pPr>
+              <w:spacing w:line="240" w:lineRule="auto"/>
+            </w:pPr>
+            <w:r/>
+            <w:r>
+              <w:rPr>
+                <w:sz w:val="20"/>
+              </w:rPr>
+              <w:t>C4 (12×12)</w:t>
+            </w:r>
+          </w:p>
+        </w:tc>
+        <w:tc>
+          <w:tcPr>
+            <w:tcW w:type="dxa" w:w="2160"/>
+          </w:tcPr>
+          <w:p>
+            <w:pPr>
+              <w:spacing w:line="240" w:lineRule="auto"/>
+            </w:pPr>
+            <w:r/>
+            <w:r>
+              <w:rPr>
+                <w:sz w:val="20"/>
+              </w:rPr>
+              <w:t>100</w:t>
+            </w:r>
+          </w:p>
+        </w:tc>
+        <w:tc>
+          <w:tcPr>
+            <w:tcW w:type="dxa" w:w="2160"/>
+          </w:tcPr>
+          <w:p>
+            <w:pPr>
+              <w:spacing w:line="240" w:lineRule="auto"/>
+            </w:pPr>
+            <w:r/>
+            <w:r>
+              <w:rPr>
+                <w:sz w:val="20"/>
+              </w:rPr>
+              <w:t>12.16</w:t>
+            </w:r>
+          </w:p>
+        </w:tc>
+        <w:tc>
+          <w:tcPr>
+            <w:tcW w:type="dxa" w:w="2160"/>
+          </w:tcPr>
+          <w:p>
+            <w:pPr>
+              <w:spacing w:line="240" w:lineRule="auto"/>
+            </w:pPr>
+            <w:r/>
+            <w:r>
+              <w:rPr>
+                <w:sz w:val="20"/>
+              </w:rPr>
+              <w:t>Obstáculo: agua</w:t>
+            </w:r>
+          </w:p>
+        </w:tc>
+      </w:tr>
+      <w:tr>
+        <w:tc>
+          <w:tcPr>
+            <w:tcW w:type="dxa" w:w="2160"/>
+          </w:tcPr>
+          <w:p>
+            <w:pPr>
+              <w:spacing w:line="240" w:lineRule="auto"/>
+            </w:pPr>
+            <w:r/>
+            <w:r>
+              <w:rPr>
+                <w:sz w:val="20"/>
+              </w:rPr>
+              <w:t>C5 (12×12)</w:t>
+            </w:r>
+          </w:p>
+        </w:tc>
+        <w:tc>
+          <w:tcPr>
+            <w:tcW w:type="dxa" w:w="2160"/>
+          </w:tcPr>
+          <w:p>
+            <w:pPr>
+              <w:spacing w:line="240" w:lineRule="auto"/>
+            </w:pPr>
+            <w:r/>
+            <w:r>
+              <w:rPr>
+                <w:sz w:val="20"/>
+              </w:rPr>
+              <w:t>100</w:t>
+            </w:r>
+          </w:p>
+        </w:tc>
+        <w:tc>
+          <w:tcPr>
+            <w:tcW w:type="dxa" w:w="2160"/>
+          </w:tcPr>
+          <w:p>
+            <w:pPr>
+              <w:spacing w:line="240" w:lineRule="auto"/>
+            </w:pPr>
+            <w:r/>
+            <w:r>
+              <w:rPr>
+                <w:sz w:val="20"/>
+              </w:rPr>
+              <w:t>12.16</w:t>
+            </w:r>
+          </w:p>
+        </w:tc>
+        <w:tc>
+          <w:tcPr>
+            <w:tcW w:type="dxa" w:w="2160"/>
+          </w:tcPr>
+          <w:p>
+            <w:pPr>
+              <w:spacing w:line="240" w:lineRule="auto"/>
+            </w:pPr>
+            <w:r/>
+            <w:r>
+              <w:rPr>
+                <w:sz w:val="20"/>
+              </w:rPr>
+              <w:t>Obstáculo: hojas</w:t>
+            </w:r>
+          </w:p>
+        </w:tc>
+      </w:tr>
+      <w:tr>
+        <w:tc>
+          <w:tcPr>
+            <w:tcW w:type="dxa" w:w="2160"/>
+          </w:tcPr>
+          <w:p>
+            <w:pPr>
+              <w:spacing w:line="240" w:lineRule="auto"/>
+            </w:pPr>
+            <w:r/>
+            <w:r>
+              <w:rPr>
+                <w:sz w:val="20"/>
+              </w:rPr>
+              <w:t>C6 (12×12)</w:t>
+            </w:r>
+          </w:p>
+        </w:tc>
+        <w:tc>
+          <w:tcPr>
+            <w:tcW w:type="dxa" w:w="2160"/>
+          </w:tcPr>
+          <w:p>
+            <w:pPr>
+              <w:spacing w:line="240" w:lineRule="auto"/>
+            </w:pPr>
+            <w:r/>
+            <w:r>
+              <w:rPr>
+                <w:sz w:val="20"/>
+              </w:rPr>
+              <w:t>100</w:t>
+            </w:r>
+          </w:p>
+        </w:tc>
+        <w:tc>
+          <w:tcPr>
+            <w:tcW w:type="dxa" w:w="2160"/>
+          </w:tcPr>
+          <w:p>
+            <w:pPr>
+              <w:spacing w:line="240" w:lineRule="auto"/>
+            </w:pPr>
+            <w:r/>
+            <w:r>
+              <w:rPr>
+                <w:sz w:val="20"/>
+              </w:rPr>
+              <w:t>12.16</w:t>
+            </w:r>
+          </w:p>
+        </w:tc>
+        <w:tc>
+          <w:tcPr>
+            <w:tcW w:type="dxa" w:w="2160"/>
+          </w:tcPr>
+          <w:p>
+            <w:pPr>
+              <w:spacing w:line="240" w:lineRule="auto"/>
+            </w:pPr>
+            <w:r/>
+            <w:r>
+              <w:rPr>
+                <w:sz w:val="20"/>
+              </w:rPr>
+              <w:t>Obstáculo: vallas</w:t>
+            </w:r>
+          </w:p>
+        </w:tc>
+      </w:tr>
+    </w:tbl>
+    <w:p/>
+    <w:p>
+      <w:pPr>
+        <w:spacing w:line="480" w:lineRule="auto"/>
+        <w:jc w:val="both"/>
+      </w:pPr>
+      <w:r>
+        <w:t>En los escenarios subcríticos (esc 1, 4, 5, 7, 10 y 11), donde N &lt; N_crit, la EDO (2) ajustó adecuadamente: G descendió y se estabilizó cerca de G*₊ con RMS entre 1.5 y 8.6 bloques. La Figura 1 muestra trayectorias normalizadas en C1/C2/C3 — al preservar N/K, los tres corrales convergen a la misma fracción.</w:t>
+      </w:r>
+    </w:p>
+    <w:p>
+      <w:pPr>
+        <w:spacing w:line="240" w:lineRule="auto"/>
+        <w:jc w:val="center"/>
+      </w:pPr>
+      <w:r>
+        <w:drawing>
+          <wp:inline xmlns:a="http://schemas.openxmlformats.org/drawingml/2006/main" xmlns:pic="http://schemas.openxmlformats.org/drawingml/2006/picture">
+            <wp:extent cx="5486400" cy="3429000"/>
+            <wp:docPr id="5" name="Picture 5"/>
+            <wp:cNvGraphicFramePr>
+              <a:graphicFrameLocks noChangeAspect="1"/>
+            </wp:cNvGraphicFramePr>
+            <a:graphic>
+              <a:graphicData uri="http://schemas.openxmlformats.org/drawingml/2006/picture">
+                <pic:pic>
+                  <pic:nvPicPr>
+                    <pic:cNvPr id="0" name="grupo_A_K_creciente.png"/>
+                    <pic:cNvPicPr/>
+                  </pic:nvPicPr>
+                  <pic:blipFill>
+                    <a:blip r:embed="rId13"/>
+                    <a:stretch>
+                      <a:fillRect/>
+                    </a:stretch>
+                  </pic:blipFill>
+                  <pic:spPr>
+                    <a:xfrm>
+                      <a:off x="0" y="0"/>
+                      <a:ext cx="5486400" cy="3429000"/>
+                    </a:xfrm>
+                    <a:prstGeom prst="rect"/>
+                  </pic:spPr>
+                </pic:pic>
+              </a:graphicData>
+            </a:graphic>
+          </wp:inline>
+        </w:drawing>
+      </w:r>
+    </w:p>
+    <w:p>
+      <w:pPr>
+        <w:spacing w:line="276" w:lineRule="auto"/>
+        <w:jc w:val="center"/>
+      </w:pPr>
+      <w:r>
+        <w:rPr>
+          <w:i/>
+          <w:sz w:val="20"/>
+        </w:rPr>
+        <w:t>Figura 1. Efecto del tamaño K en régimen subcrítico (C1, C2, C3) con eje normalizado G/K.</w:t>
       </w:r>
     </w:p>
     <w:p>
@@ -442,22 +1105,1922 @@
         <w:jc w:val="both"/>
       </w:pPr>
       <w:r>
+        <w:t>Los escenarios supercríticos (esc 3, 6 y 9) revelaron un defecto de la EDO original: el modelo predice colapso a G = 0 cuando cN &gt; rK/4, pero los datos mostraron mesetas estables en G ≈ 13, 56 y 158 respectivamente. La explicación física es que cuando el pasto se vuelve escaso, las ovejas pierden tiempo buscando bloques aislados y el consumo efectivo cae, comportamiento que el término constante −cN no captura. Para corregirlo se introdujo la respuesta funcional Tipo II de Holling (Holling, 1959), ecuación (5), con una constante h de semi-saturación; cuando G ≫ h se recupera la ecuación (2), y cuando G → 0 el consumo se frena suavemente.</w:t>
+      </w:r>
+    </w:p>
+    <w:p>
+      <w:pPr>
+        <w:tabs>
+          <w:tab w:pos="8640" w:val="right"/>
+        </w:tabs>
+        <w:spacing w:line="360" w:lineRule="auto"/>
+        <w:jc w:val="center"/>
+      </w:pPr>
+      <w:r>
+        <w:drawing>
+          <wp:inline xmlns:a="http://schemas.openxmlformats.org/drawingml/2006/main" xmlns:pic="http://schemas.openxmlformats.org/drawingml/2006/picture">
+            <wp:extent cx="1538344" cy="279400"/>
+            <wp:docPr id="6" name="Picture 6"/>
+            <wp:cNvGraphicFramePr>
+              <a:graphicFrameLocks noChangeAspect="1"/>
+            </wp:cNvGraphicFramePr>
+            <a:graphic>
+              <a:graphicData uri="http://schemas.openxmlformats.org/drawingml/2006/picture">
+                <pic:pic>
+                  <pic:nvPicPr>
+                    <pic:cNvPr id="0" name="image.png"/>
+                    <pic:cNvPicPr/>
+                  </pic:nvPicPr>
+                  <pic:blipFill>
+                    <a:blip r:embed="rId14"/>
+                    <a:stretch>
+                      <a:fillRect/>
+                    </a:stretch>
+                  </pic:blipFill>
+                  <pic:spPr>
+                    <a:xfrm>
+                      <a:off x="0" y="0"/>
+                      <a:ext cx="1538344" cy="279400"/>
+                    </a:xfrm>
+                    <a:prstGeom prst="rect"/>
+                  </pic:spPr>
+                </pic:pic>
+              </a:graphicData>
+            </a:graphic>
+          </wp:inline>
+        </w:drawing>
+      </w:r>
+      <w:r>
+        <w:rPr>
+          <w:sz w:val="22"/>
+        </w:rPr>
+        <w:tab/>
+        <w:t>(5)</w:t>
+      </w:r>
+    </w:p>
+    <w:p>
+      <w:pPr>
+        <w:spacing w:line="480" w:lineRule="auto"/>
+        <w:jc w:val="both"/>
+      </w:pPr>
+      <w:r>
+        <w:t>El equilibrio del modelo refinado satisface la cuadrática (6) tras descartar la raíz trivial G = 0.</w:t>
+      </w:r>
+    </w:p>
+    <w:p>
+      <w:pPr>
+        <w:tabs>
+          <w:tab w:pos="8640" w:val="right"/>
+        </w:tabs>
+        <w:spacing w:line="360" w:lineRule="auto"/>
+        <w:jc w:val="center"/>
+      </w:pPr>
+      <w:r>
+        <w:drawing>
+          <wp:inline xmlns:a="http://schemas.openxmlformats.org/drawingml/2006/main" xmlns:pic="http://schemas.openxmlformats.org/drawingml/2006/picture">
+            <wp:extent cx="2270125" cy="279400"/>
+            <wp:docPr id="7" name="Picture 7"/>
+            <wp:cNvGraphicFramePr>
+              <a:graphicFrameLocks noChangeAspect="1"/>
+            </wp:cNvGraphicFramePr>
+            <a:graphic>
+              <a:graphicData uri="http://schemas.openxmlformats.org/drawingml/2006/picture">
+                <pic:pic>
+                  <pic:nvPicPr>
+                    <pic:cNvPr id="0" name="image.png"/>
+                    <pic:cNvPicPr/>
+                  </pic:nvPicPr>
+                  <pic:blipFill>
+                    <a:blip r:embed="rId15"/>
+                    <a:stretch>
+                      <a:fillRect/>
+                    </a:stretch>
+                  </pic:blipFill>
+                  <pic:spPr>
+                    <a:xfrm>
+                      <a:off x="0" y="0"/>
+                      <a:ext cx="2270125" cy="279400"/>
+                    </a:xfrm>
+                    <a:prstGeom prst="rect"/>
+                  </pic:spPr>
+                </pic:pic>
+              </a:graphicData>
+            </a:graphic>
+          </wp:inline>
+        </w:drawing>
+      </w:r>
+      <w:r>
+        <w:rPr>
+          <w:sz w:val="22"/>
+        </w:rPr>
+        <w:tab/>
+        <w:t>(6)</w:t>
+      </w:r>
+    </w:p>
+    <w:p>
+      <w:pPr>
+        <w:spacing w:line="480" w:lineRule="auto"/>
+        <w:jc w:val="both"/>
+      </w:pPr>
+      <w:r>
+        <w:t>La literatura ecológica reporta h/K entre 0.1 y 0.5 según la dificultad de búsqueda (Real, 1977; Turchin, 2003); aquí se adoptó h = K/2, valor que ajusta consistentemente las tres mesetas supercríticas y refleja la naturaleza discreta del corral (bloques individuales, no recurso continuo). La Figura 2 compara ambos modelos en los escenarios supercríticos.</w:t>
+      </w:r>
+    </w:p>
+    <w:p>
+      <w:pPr>
+        <w:spacing w:line="240" w:lineRule="auto"/>
+        <w:jc w:val="center"/>
+      </w:pPr>
+      <w:r>
+        <w:drawing>
+          <wp:inline xmlns:a="http://schemas.openxmlformats.org/drawingml/2006/main" xmlns:pic="http://schemas.openxmlformats.org/drawingml/2006/picture">
+            <wp:extent cx="5943600" cy="1910443"/>
+            <wp:docPr id="8" name="Picture 8"/>
+            <wp:cNvGraphicFramePr>
+              <a:graphicFrameLocks noChangeAspect="1"/>
+            </wp:cNvGraphicFramePr>
+            <a:graphic>
+              <a:graphicData uri="http://schemas.openxmlformats.org/drawingml/2006/picture">
+                <pic:pic>
+                  <pic:nvPicPr>
+                    <pic:cNvPr id="0" name="comparacion_modelos.png"/>
+                    <pic:cNvPicPr/>
+                  </pic:nvPicPr>
+                  <pic:blipFill>
+                    <a:blip r:embed="rId16"/>
+                    <a:stretch>
+                      <a:fillRect/>
+                    </a:stretch>
+                  </pic:blipFill>
+                  <pic:spPr>
+                    <a:xfrm>
+                      <a:off x="0" y="0"/>
+                      <a:ext cx="5943600" cy="1910443"/>
+                    </a:xfrm>
+                    <a:prstGeom prst="rect"/>
+                  </pic:spPr>
+                </pic:pic>
+              </a:graphicData>
+            </a:graphic>
+          </wp:inline>
+        </w:drawing>
+      </w:r>
+    </w:p>
+    <w:p>
+      <w:pPr>
+        <w:spacing w:line="276" w:lineRule="auto"/>
+        <w:jc w:val="center"/>
+      </w:pPr>
+      <w:r>
         <w:rPr>
           <w:i/>
+          <w:sz w:val="20"/>
         </w:rPr>
-        <w:t>[JULIÁN — Resultados parte B | Escenarios 7-12, comparación de obstáculos]</w:t>
-        <w:br/>
-        <w:br/>
-        <w:t>(1) Analizar el bloque C3 grande (esc 7-9), destacando que esc 8 (N=25 vs N_crit=27.36) cae cerca del crítico — bifurcación visible.</w:t>
-        <w:br/>
-        <w:br/>
-        <w:t>(2) Enfocar la comparación directa entre C2 esc 5, C4 esc 10 (agua), C5 esc 11 (hojas), C6 esc 12 (vallas) — todos con K=100 y N=10. Aislar el efecto del obstáculo. Discutir si las ovejas pueden cruzar (agua → sí nadando, hojas → sí saltando, vallas → solo rodear). Cuantificar K efectivo y RMS por obstáculo.</w:t>
-        <w:br/>
-        <w:br/>
-        <w:t>(3) Insertar grupo_B_obstaculos.png como Figura 2 y grupo_C_bifurcacion.png como Figura 3.</w:t>
-        <w:br/>
-        <w:br/>
-        <w:t>(4) Etiquetar la tabla RMS de los escenarios 7-12 como Tabla 3 (o Mariana puede unificar en una sola Tabla 2 al integrar).</w:t>
+        <w:t>Figura 2. Comparación de modelos en régimen supercrítico (esc 3, 6, 9). La EDO original colapsa a cero; Holling reproduce las mesetas observadas.</w:t>
+      </w:r>
+    </w:p>
+    <w:p>
+      <w:pPr>
+        <w:spacing w:line="276" w:lineRule="auto"/>
+        <w:jc w:val="center"/>
+      </w:pPr>
+      <w:r>
+        <w:rPr>
+          <w:i/>
+          <w:sz w:val="20"/>
+        </w:rPr>
+        <w:t>Tabla 2. RMS por escenario, EDO original vs Holling Tipo II.</w:t>
+      </w:r>
+    </w:p>
+    <w:tbl>
+      <w:tblPr>
+        <w:tblStyle w:val="LightGrid-Accent1"/>
+        <w:tblW w:type="auto" w:w="0"/>
+        <w:jc w:val="center"/>
+        <w:tblLook w:firstColumn="1" w:firstRow="1" w:lastColumn="0" w:lastRow="0" w:noHBand="0" w:noVBand="1" w:val="04A0"/>
+      </w:tblPr>
+      <w:tblGrid>
+        <w:gridCol w:w="1234"/>
+        <w:gridCol w:w="1234"/>
+        <w:gridCol w:w="1234"/>
+        <w:gridCol w:w="1234"/>
+        <w:gridCol w:w="1234"/>
+        <w:gridCol w:w="1234"/>
+        <w:gridCol w:w="1234"/>
+      </w:tblGrid>
+      <w:tr>
+        <w:tc>
+          <w:tcPr>
+            <w:tcW w:type="dxa" w:w="1234"/>
+          </w:tcPr>
+          <w:p>
+            <w:pPr>
+              <w:spacing w:line="240" w:lineRule="auto"/>
+            </w:pPr>
+            <w:r/>
+            <w:r>
+              <w:rPr>
+                <w:b/>
+                <w:sz w:val="20"/>
+              </w:rPr>
+              <w:t>Esc</w:t>
+            </w:r>
+          </w:p>
+        </w:tc>
+        <w:tc>
+          <w:tcPr>
+            <w:tcW w:type="dxa" w:w="1234"/>
+          </w:tcPr>
+          <w:p>
+            <w:pPr>
+              <w:spacing w:line="240" w:lineRule="auto"/>
+            </w:pPr>
+            <w:r/>
+            <w:r>
+              <w:rPr>
+                <w:b/>
+                <w:sz w:val="20"/>
+              </w:rPr>
+              <w:t>Corral</w:t>
+            </w:r>
+          </w:p>
+        </w:tc>
+        <w:tc>
+          <w:tcPr>
+            <w:tcW w:type="dxa" w:w="1234"/>
+          </w:tcPr>
+          <w:p>
+            <w:pPr>
+              <w:spacing w:line="240" w:lineRule="auto"/>
+            </w:pPr>
+            <w:r/>
+            <w:r>
+              <w:rPr>
+                <w:b/>
+                <w:sz w:val="20"/>
+              </w:rPr>
+              <w:t>N</w:t>
+            </w:r>
+          </w:p>
+        </w:tc>
+        <w:tc>
+          <w:tcPr>
+            <w:tcW w:type="dxa" w:w="1234"/>
+          </w:tcPr>
+          <w:p>
+            <w:pPr>
+              <w:spacing w:line="240" w:lineRule="auto"/>
+            </w:pPr>
+            <w:r/>
+            <w:r>
+              <w:rPr>
+                <w:b/>
+                <w:sz w:val="20"/>
+              </w:rPr>
+              <w:t>Régimen</w:t>
+            </w:r>
+          </w:p>
+        </w:tc>
+        <w:tc>
+          <w:tcPr>
+            <w:tcW w:type="dxa" w:w="1234"/>
+          </w:tcPr>
+          <w:p>
+            <w:pPr>
+              <w:spacing w:line="240" w:lineRule="auto"/>
+            </w:pPr>
+            <w:r/>
+            <w:r>
+              <w:rPr>
+                <w:b/>
+                <w:sz w:val="20"/>
+              </w:rPr>
+              <w:t>RMS orig.</w:t>
+            </w:r>
+          </w:p>
+        </w:tc>
+        <w:tc>
+          <w:tcPr>
+            <w:tcW w:type="dxa" w:w="1234"/>
+          </w:tcPr>
+          <w:p>
+            <w:pPr>
+              <w:spacing w:line="240" w:lineRule="auto"/>
+            </w:pPr>
+            <w:r/>
+            <w:r>
+              <w:rPr>
+                <w:b/>
+                <w:sz w:val="20"/>
+              </w:rPr>
+              <w:t>RMS Holling</w:t>
+            </w:r>
+          </w:p>
+        </w:tc>
+        <w:tc>
+          <w:tcPr>
+            <w:tcW w:type="dxa" w:w="1234"/>
+          </w:tcPr>
+          <w:p>
+            <w:pPr>
+              <w:spacing w:line="240" w:lineRule="auto"/>
+            </w:pPr>
+            <w:r/>
+            <w:r>
+              <w:rPr>
+                <w:b/>
+                <w:sz w:val="20"/>
+              </w:rPr>
+              <w:t>Mejora</w:t>
+            </w:r>
+          </w:p>
+        </w:tc>
+      </w:tr>
+      <w:tr>
+        <w:tc>
+          <w:tcPr>
+            <w:tcW w:type="dxa" w:w="1234"/>
+          </w:tcPr>
+          <w:p>
+            <w:pPr>
+              <w:spacing w:line="240" w:lineRule="auto"/>
+            </w:pPr>
+            <w:r/>
+            <w:r>
+              <w:rPr>
+                <w:sz w:val="20"/>
+              </w:rPr>
+              <w:t>1</w:t>
+            </w:r>
+          </w:p>
+        </w:tc>
+        <w:tc>
+          <w:tcPr>
+            <w:tcW w:type="dxa" w:w="1234"/>
+          </w:tcPr>
+          <w:p>
+            <w:pPr>
+              <w:spacing w:line="240" w:lineRule="auto"/>
+            </w:pPr>
+            <w:r/>
+            <w:r>
+              <w:rPr>
+                <w:sz w:val="20"/>
+              </w:rPr>
+              <w:t>C1 5x5</w:t>
+            </w:r>
+          </w:p>
+        </w:tc>
+        <w:tc>
+          <w:tcPr>
+            <w:tcW w:type="dxa" w:w="1234"/>
+          </w:tcPr>
+          <w:p>
+            <w:pPr>
+              <w:spacing w:line="240" w:lineRule="auto"/>
+            </w:pPr>
+            <w:r/>
+            <w:r>
+              <w:rPr>
+                <w:sz w:val="20"/>
+              </w:rPr>
+              <w:t>1</w:t>
+            </w:r>
+          </w:p>
+        </w:tc>
+        <w:tc>
+          <w:tcPr>
+            <w:tcW w:type="dxa" w:w="1234"/>
+          </w:tcPr>
+          <w:p>
+            <w:pPr>
+              <w:spacing w:line="240" w:lineRule="auto"/>
+            </w:pPr>
+            <w:r/>
+            <w:r>
+              <w:rPr>
+                <w:sz w:val="20"/>
+              </w:rPr>
+              <w:t>subcritico</w:t>
+            </w:r>
+          </w:p>
+        </w:tc>
+        <w:tc>
+          <w:tcPr>
+            <w:tcW w:type="dxa" w:w="1234"/>
+          </w:tcPr>
+          <w:p>
+            <w:pPr>
+              <w:spacing w:line="240" w:lineRule="auto"/>
+            </w:pPr>
+            <w:r/>
+            <w:r>
+              <w:rPr>
+                <w:sz w:val="20"/>
+              </w:rPr>
+              <w:t>1.50</w:t>
+            </w:r>
+          </w:p>
+        </w:tc>
+        <w:tc>
+          <w:tcPr>
+            <w:tcW w:type="dxa" w:w="1234"/>
+          </w:tcPr>
+          <w:p>
+            <w:pPr>
+              <w:spacing w:line="240" w:lineRule="auto"/>
+            </w:pPr>
+            <w:r/>
+            <w:r>
+              <w:rPr>
+                <w:sz w:val="20"/>
+              </w:rPr>
+              <w:t>2.06</w:t>
+            </w:r>
+          </w:p>
+        </w:tc>
+        <w:tc>
+          <w:tcPr>
+            <w:tcW w:type="dxa" w:w="1234"/>
+          </w:tcPr>
+          <w:p>
+            <w:pPr>
+              <w:spacing w:line="240" w:lineRule="auto"/>
+            </w:pPr>
+            <w:r/>
+            <w:r>
+              <w:rPr>
+                <w:sz w:val="20"/>
+              </w:rPr>
+              <w:t>-36.5 %</w:t>
+            </w:r>
+          </w:p>
+        </w:tc>
+      </w:tr>
+      <w:tr>
+        <w:tc>
+          <w:tcPr>
+            <w:tcW w:type="dxa" w:w="1234"/>
+          </w:tcPr>
+          <w:p>
+            <w:pPr>
+              <w:spacing w:line="240" w:lineRule="auto"/>
+            </w:pPr>
+            <w:r/>
+            <w:r>
+              <w:rPr>
+                <w:sz w:val="20"/>
+              </w:rPr>
+              <w:t>2</w:t>
+            </w:r>
+          </w:p>
+        </w:tc>
+        <w:tc>
+          <w:tcPr>
+            <w:tcW w:type="dxa" w:w="1234"/>
+          </w:tcPr>
+          <w:p>
+            <w:pPr>
+              <w:spacing w:line="240" w:lineRule="auto"/>
+            </w:pPr>
+            <w:r/>
+            <w:r>
+              <w:rPr>
+                <w:sz w:val="20"/>
+              </w:rPr>
+              <w:t>C1 5x5</w:t>
+            </w:r>
+          </w:p>
+        </w:tc>
+        <w:tc>
+          <w:tcPr>
+            <w:tcW w:type="dxa" w:w="1234"/>
+          </w:tcPr>
+          <w:p>
+            <w:pPr>
+              <w:spacing w:line="240" w:lineRule="auto"/>
+            </w:pPr>
+            <w:r/>
+            <w:r>
+              <w:rPr>
+                <w:sz w:val="20"/>
+              </w:rPr>
+              <w:t>3</w:t>
+            </w:r>
+          </w:p>
+        </w:tc>
+        <w:tc>
+          <w:tcPr>
+            <w:tcW w:type="dxa" w:w="1234"/>
+          </w:tcPr>
+          <w:p>
+            <w:pPr>
+              <w:spacing w:line="240" w:lineRule="auto"/>
+            </w:pPr>
+            <w:r/>
+            <w:r>
+              <w:rPr>
+                <w:sz w:val="20"/>
+              </w:rPr>
+              <w:t>critico</w:t>
+            </w:r>
+          </w:p>
+        </w:tc>
+        <w:tc>
+          <w:tcPr>
+            <w:tcW w:type="dxa" w:w="1234"/>
+          </w:tcPr>
+          <w:p>
+            <w:pPr>
+              <w:spacing w:line="240" w:lineRule="auto"/>
+            </w:pPr>
+            <w:r/>
+            <w:r>
+              <w:rPr>
+                <w:sz w:val="20"/>
+              </w:rPr>
+              <w:t>4.08</w:t>
+            </w:r>
+          </w:p>
+        </w:tc>
+        <w:tc>
+          <w:tcPr>
+            <w:tcW w:type="dxa" w:w="1234"/>
+          </w:tcPr>
+          <w:p>
+            <w:pPr>
+              <w:spacing w:line="240" w:lineRule="auto"/>
+            </w:pPr>
+            <w:r/>
+            <w:r>
+              <w:rPr>
+                <w:sz w:val="20"/>
+              </w:rPr>
+              <w:t>3.10</w:t>
+            </w:r>
+          </w:p>
+        </w:tc>
+        <w:tc>
+          <w:tcPr>
+            <w:tcW w:type="dxa" w:w="1234"/>
+          </w:tcPr>
+          <w:p>
+            <w:pPr>
+              <w:spacing w:line="240" w:lineRule="auto"/>
+            </w:pPr>
+            <w:r/>
+            <w:r>
+              <w:rPr>
+                <w:sz w:val="20"/>
+              </w:rPr>
+              <w:t>+24.0 %</w:t>
+            </w:r>
+          </w:p>
+        </w:tc>
+      </w:tr>
+      <w:tr>
+        <w:tc>
+          <w:tcPr>
+            <w:tcW w:type="dxa" w:w="1234"/>
+          </w:tcPr>
+          <w:p>
+            <w:pPr>
+              <w:spacing w:line="240" w:lineRule="auto"/>
+            </w:pPr>
+            <w:r/>
+            <w:r>
+              <w:rPr>
+                <w:sz w:val="20"/>
+              </w:rPr>
+              <w:t>3</w:t>
+            </w:r>
+          </w:p>
+        </w:tc>
+        <w:tc>
+          <w:tcPr>
+            <w:tcW w:type="dxa" w:w="1234"/>
+          </w:tcPr>
+          <w:p>
+            <w:pPr>
+              <w:spacing w:line="240" w:lineRule="auto"/>
+            </w:pPr>
+            <w:r/>
+            <w:r>
+              <w:rPr>
+                <w:sz w:val="20"/>
+              </w:rPr>
+              <w:t>C1 5x5</w:t>
+            </w:r>
+          </w:p>
+        </w:tc>
+        <w:tc>
+          <w:tcPr>
+            <w:tcW w:type="dxa" w:w="1234"/>
+          </w:tcPr>
+          <w:p>
+            <w:pPr>
+              <w:spacing w:line="240" w:lineRule="auto"/>
+            </w:pPr>
+            <w:r/>
+            <w:r>
+              <w:rPr>
+                <w:sz w:val="20"/>
+              </w:rPr>
+              <w:t>5</w:t>
+            </w:r>
+          </w:p>
+        </w:tc>
+        <w:tc>
+          <w:tcPr>
+            <w:tcW w:type="dxa" w:w="1234"/>
+          </w:tcPr>
+          <w:p>
+            <w:pPr>
+              <w:spacing w:line="240" w:lineRule="auto"/>
+            </w:pPr>
+            <w:r/>
+            <w:r>
+              <w:rPr>
+                <w:sz w:val="20"/>
+              </w:rPr>
+              <w:t>supercritico</w:t>
+            </w:r>
+          </w:p>
+        </w:tc>
+        <w:tc>
+          <w:tcPr>
+            <w:tcW w:type="dxa" w:w="1234"/>
+          </w:tcPr>
+          <w:p>
+            <w:pPr>
+              <w:spacing w:line="240" w:lineRule="auto"/>
+            </w:pPr>
+            <w:r/>
+            <w:r>
+              <w:rPr>
+                <w:sz w:val="20"/>
+              </w:rPr>
+              <w:t>13.90</w:t>
+            </w:r>
+          </w:p>
+        </w:tc>
+        <w:tc>
+          <w:tcPr>
+            <w:tcW w:type="dxa" w:w="1234"/>
+          </w:tcPr>
+          <w:p>
+            <w:pPr>
+              <w:spacing w:line="240" w:lineRule="auto"/>
+            </w:pPr>
+            <w:r/>
+            <w:r>
+              <w:rPr>
+                <w:sz w:val="20"/>
+              </w:rPr>
+              <w:t>2.58</w:t>
+            </w:r>
+          </w:p>
+        </w:tc>
+        <w:tc>
+          <w:tcPr>
+            <w:tcW w:type="dxa" w:w="1234"/>
+          </w:tcPr>
+          <w:p>
+            <w:pPr>
+              <w:spacing w:line="240" w:lineRule="auto"/>
+            </w:pPr>
+            <w:r/>
+            <w:r>
+              <w:rPr>
+                <w:sz w:val="20"/>
+              </w:rPr>
+              <w:t>+81.5 %</w:t>
+            </w:r>
+          </w:p>
+        </w:tc>
+      </w:tr>
+      <w:tr>
+        <w:tc>
+          <w:tcPr>
+            <w:tcW w:type="dxa" w:w="1234"/>
+          </w:tcPr>
+          <w:p>
+            <w:pPr>
+              <w:spacing w:line="240" w:lineRule="auto"/>
+            </w:pPr>
+            <w:r/>
+            <w:r>
+              <w:rPr>
+                <w:sz w:val="20"/>
+              </w:rPr>
+              <w:t>4</w:t>
+            </w:r>
+          </w:p>
+        </w:tc>
+        <w:tc>
+          <w:tcPr>
+            <w:tcW w:type="dxa" w:w="1234"/>
+          </w:tcPr>
+          <w:p>
+            <w:pPr>
+              <w:spacing w:line="240" w:lineRule="auto"/>
+            </w:pPr>
+            <w:r/>
+            <w:r>
+              <w:rPr>
+                <w:sz w:val="20"/>
+              </w:rPr>
+              <w:t>C2 10x10</w:t>
+            </w:r>
+          </w:p>
+        </w:tc>
+        <w:tc>
+          <w:tcPr>
+            <w:tcW w:type="dxa" w:w="1234"/>
+          </w:tcPr>
+          <w:p>
+            <w:pPr>
+              <w:spacing w:line="240" w:lineRule="auto"/>
+            </w:pPr>
+            <w:r/>
+            <w:r>
+              <w:rPr>
+                <w:sz w:val="20"/>
+              </w:rPr>
+              <w:t>5</w:t>
+            </w:r>
+          </w:p>
+        </w:tc>
+        <w:tc>
+          <w:tcPr>
+            <w:tcW w:type="dxa" w:w="1234"/>
+          </w:tcPr>
+          <w:p>
+            <w:pPr>
+              <w:spacing w:line="240" w:lineRule="auto"/>
+            </w:pPr>
+            <w:r/>
+            <w:r>
+              <w:rPr>
+                <w:sz w:val="20"/>
+              </w:rPr>
+              <w:t>subcritico</w:t>
+            </w:r>
+          </w:p>
+        </w:tc>
+        <w:tc>
+          <w:tcPr>
+            <w:tcW w:type="dxa" w:w="1234"/>
+          </w:tcPr>
+          <w:p>
+            <w:pPr>
+              <w:spacing w:line="240" w:lineRule="auto"/>
+            </w:pPr>
+            <w:r/>
+            <w:r>
+              <w:rPr>
+                <w:sz w:val="20"/>
+              </w:rPr>
+              <w:t>2.91</w:t>
+            </w:r>
+          </w:p>
+        </w:tc>
+        <w:tc>
+          <w:tcPr>
+            <w:tcW w:type="dxa" w:w="1234"/>
+          </w:tcPr>
+          <w:p>
+            <w:pPr>
+              <w:spacing w:line="240" w:lineRule="auto"/>
+            </w:pPr>
+            <w:r/>
+            <w:r>
+              <w:rPr>
+                <w:sz w:val="20"/>
+              </w:rPr>
+              <w:t>5.86</w:t>
+            </w:r>
+          </w:p>
+        </w:tc>
+        <w:tc>
+          <w:tcPr>
+            <w:tcW w:type="dxa" w:w="1234"/>
+          </w:tcPr>
+          <w:p>
+            <w:pPr>
+              <w:spacing w:line="240" w:lineRule="auto"/>
+            </w:pPr>
+            <w:r/>
+            <w:r>
+              <w:rPr>
+                <w:sz w:val="20"/>
+              </w:rPr>
+              <w:t>-101.3 %</w:t>
+            </w:r>
+          </w:p>
+        </w:tc>
+      </w:tr>
+      <w:tr>
+        <w:tc>
+          <w:tcPr>
+            <w:tcW w:type="dxa" w:w="1234"/>
+          </w:tcPr>
+          <w:p>
+            <w:pPr>
+              <w:spacing w:line="240" w:lineRule="auto"/>
+            </w:pPr>
+            <w:r/>
+            <w:r>
+              <w:rPr>
+                <w:sz w:val="20"/>
+              </w:rPr>
+              <w:t>5</w:t>
+            </w:r>
+          </w:p>
+        </w:tc>
+        <w:tc>
+          <w:tcPr>
+            <w:tcW w:type="dxa" w:w="1234"/>
+          </w:tcPr>
+          <w:p>
+            <w:pPr>
+              <w:spacing w:line="240" w:lineRule="auto"/>
+            </w:pPr>
+            <w:r/>
+            <w:r>
+              <w:rPr>
+                <w:sz w:val="20"/>
+              </w:rPr>
+              <w:t>C2 10x10</w:t>
+            </w:r>
+          </w:p>
+        </w:tc>
+        <w:tc>
+          <w:tcPr>
+            <w:tcW w:type="dxa" w:w="1234"/>
+          </w:tcPr>
+          <w:p>
+            <w:pPr>
+              <w:spacing w:line="240" w:lineRule="auto"/>
+            </w:pPr>
+            <w:r/>
+            <w:r>
+              <w:rPr>
+                <w:sz w:val="20"/>
+              </w:rPr>
+              <w:t>10</w:t>
+            </w:r>
+          </w:p>
+        </w:tc>
+        <w:tc>
+          <w:tcPr>
+            <w:tcW w:type="dxa" w:w="1234"/>
+          </w:tcPr>
+          <w:p>
+            <w:pPr>
+              <w:spacing w:line="240" w:lineRule="auto"/>
+            </w:pPr>
+            <w:r/>
+            <w:r>
+              <w:rPr>
+                <w:sz w:val="20"/>
+              </w:rPr>
+              <w:t>subcritico</w:t>
+            </w:r>
+          </w:p>
+        </w:tc>
+        <w:tc>
+          <w:tcPr>
+            <w:tcW w:type="dxa" w:w="1234"/>
+          </w:tcPr>
+          <w:p>
+            <w:pPr>
+              <w:spacing w:line="240" w:lineRule="auto"/>
+            </w:pPr>
+            <w:r/>
+            <w:r>
+              <w:rPr>
+                <w:sz w:val="20"/>
+              </w:rPr>
+              <w:t>8.62</w:t>
+            </w:r>
+          </w:p>
+        </w:tc>
+        <w:tc>
+          <w:tcPr>
+            <w:tcW w:type="dxa" w:w="1234"/>
+          </w:tcPr>
+          <w:p>
+            <w:pPr>
+              <w:spacing w:line="240" w:lineRule="auto"/>
+            </w:pPr>
+            <w:r/>
+            <w:r>
+              <w:rPr>
+                <w:sz w:val="20"/>
+              </w:rPr>
+              <w:t>6.43</w:t>
+            </w:r>
+          </w:p>
+        </w:tc>
+        <w:tc>
+          <w:tcPr>
+            <w:tcW w:type="dxa" w:w="1234"/>
+          </w:tcPr>
+          <w:p>
+            <w:pPr>
+              <w:spacing w:line="240" w:lineRule="auto"/>
+            </w:pPr>
+            <w:r/>
+            <w:r>
+              <w:rPr>
+                <w:sz w:val="20"/>
+              </w:rPr>
+              <w:t>+25.4 %</w:t>
+            </w:r>
+          </w:p>
+        </w:tc>
+      </w:tr>
+      <w:tr>
+        <w:tc>
+          <w:tcPr>
+            <w:tcW w:type="dxa" w:w="1234"/>
+          </w:tcPr>
+          <w:p>
+            <w:pPr>
+              <w:spacing w:line="240" w:lineRule="auto"/>
+            </w:pPr>
+            <w:r/>
+            <w:r>
+              <w:rPr>
+                <w:sz w:val="20"/>
+              </w:rPr>
+              <w:t>6</w:t>
+            </w:r>
+          </w:p>
+        </w:tc>
+        <w:tc>
+          <w:tcPr>
+            <w:tcW w:type="dxa" w:w="1234"/>
+          </w:tcPr>
+          <w:p>
+            <w:pPr>
+              <w:spacing w:line="240" w:lineRule="auto"/>
+            </w:pPr>
+            <w:r/>
+            <w:r>
+              <w:rPr>
+                <w:sz w:val="20"/>
+              </w:rPr>
+              <w:t>C2 10x10</w:t>
+            </w:r>
+          </w:p>
+        </w:tc>
+        <w:tc>
+          <w:tcPr>
+            <w:tcW w:type="dxa" w:w="1234"/>
+          </w:tcPr>
+          <w:p>
+            <w:pPr>
+              <w:spacing w:line="240" w:lineRule="auto"/>
+            </w:pPr>
+            <w:r/>
+            <w:r>
+              <w:rPr>
+                <w:sz w:val="20"/>
+              </w:rPr>
+              <w:t>20</w:t>
+            </w:r>
+          </w:p>
+        </w:tc>
+        <w:tc>
+          <w:tcPr>
+            <w:tcW w:type="dxa" w:w="1234"/>
+          </w:tcPr>
+          <w:p>
+            <w:pPr>
+              <w:spacing w:line="240" w:lineRule="auto"/>
+            </w:pPr>
+            <w:r/>
+            <w:r>
+              <w:rPr>
+                <w:sz w:val="20"/>
+              </w:rPr>
+              <w:t>supercritico</w:t>
+            </w:r>
+          </w:p>
+        </w:tc>
+        <w:tc>
+          <w:tcPr>
+            <w:tcW w:type="dxa" w:w="1234"/>
+          </w:tcPr>
+          <w:p>
+            <w:pPr>
+              <w:spacing w:line="240" w:lineRule="auto"/>
+            </w:pPr>
+            <w:r/>
+            <w:r>
+              <w:rPr>
+                <w:sz w:val="20"/>
+              </w:rPr>
+              <w:t>57.81</w:t>
+            </w:r>
+          </w:p>
+        </w:tc>
+        <w:tc>
+          <w:tcPr>
+            <w:tcW w:type="dxa" w:w="1234"/>
+          </w:tcPr>
+          <w:p>
+            <w:pPr>
+              <w:spacing w:line="240" w:lineRule="auto"/>
+            </w:pPr>
+            <w:r/>
+            <w:r>
+              <w:rPr>
+                <w:sz w:val="20"/>
+              </w:rPr>
+              <w:t>6.10</w:t>
+            </w:r>
+          </w:p>
+        </w:tc>
+        <w:tc>
+          <w:tcPr>
+            <w:tcW w:type="dxa" w:w="1234"/>
+          </w:tcPr>
+          <w:p>
+            <w:pPr>
+              <w:spacing w:line="240" w:lineRule="auto"/>
+            </w:pPr>
+            <w:r/>
+            <w:r>
+              <w:rPr>
+                <w:sz w:val="20"/>
+              </w:rPr>
+              <w:t>+89.5 %</w:t>
+            </w:r>
+          </w:p>
+        </w:tc>
+      </w:tr>
+      <w:tr>
+        <w:tc>
+          <w:tcPr>
+            <w:tcW w:type="dxa" w:w="1234"/>
+          </w:tcPr>
+          <w:p>
+            <w:pPr>
+              <w:spacing w:line="240" w:lineRule="auto"/>
+            </w:pPr>
+            <w:r/>
+            <w:r>
+              <w:rPr>
+                <w:sz w:val="20"/>
+              </w:rPr>
+              <w:t>7</w:t>
+            </w:r>
+          </w:p>
+        </w:tc>
+        <w:tc>
+          <w:tcPr>
+            <w:tcW w:type="dxa" w:w="1234"/>
+          </w:tcPr>
+          <w:p>
+            <w:pPr>
+              <w:spacing w:line="240" w:lineRule="auto"/>
+            </w:pPr>
+            <w:r/>
+            <w:r>
+              <w:rPr>
+                <w:sz w:val="20"/>
+              </w:rPr>
+              <w:t>C3 15x15</w:t>
+            </w:r>
+          </w:p>
+        </w:tc>
+        <w:tc>
+          <w:tcPr>
+            <w:tcW w:type="dxa" w:w="1234"/>
+          </w:tcPr>
+          <w:p>
+            <w:pPr>
+              <w:spacing w:line="240" w:lineRule="auto"/>
+            </w:pPr>
+            <w:r/>
+            <w:r>
+              <w:rPr>
+                <w:sz w:val="20"/>
+              </w:rPr>
+              <w:t>10</w:t>
+            </w:r>
+          </w:p>
+        </w:tc>
+        <w:tc>
+          <w:tcPr>
+            <w:tcW w:type="dxa" w:w="1234"/>
+          </w:tcPr>
+          <w:p>
+            <w:pPr>
+              <w:spacing w:line="240" w:lineRule="auto"/>
+            </w:pPr>
+            <w:r/>
+            <w:r>
+              <w:rPr>
+                <w:sz w:val="20"/>
+              </w:rPr>
+              <w:t>subcritico</w:t>
+            </w:r>
+          </w:p>
+        </w:tc>
+        <w:tc>
+          <w:tcPr>
+            <w:tcW w:type="dxa" w:w="1234"/>
+          </w:tcPr>
+          <w:p>
+            <w:pPr>
+              <w:spacing w:line="240" w:lineRule="auto"/>
+            </w:pPr>
+            <w:r/>
+            <w:r>
+              <w:rPr>
+                <w:sz w:val="20"/>
+              </w:rPr>
+              <w:t>4.40</w:t>
+            </w:r>
+          </w:p>
+        </w:tc>
+        <w:tc>
+          <w:tcPr>
+            <w:tcW w:type="dxa" w:w="1234"/>
+          </w:tcPr>
+          <w:p>
+            <w:pPr>
+              <w:spacing w:line="240" w:lineRule="auto"/>
+            </w:pPr>
+            <w:r/>
+            <w:r>
+              <w:rPr>
+                <w:sz w:val="20"/>
+              </w:rPr>
+              <w:t>9.03</w:t>
+            </w:r>
+          </w:p>
+        </w:tc>
+        <w:tc>
+          <w:tcPr>
+            <w:tcW w:type="dxa" w:w="1234"/>
+          </w:tcPr>
+          <w:p>
+            <w:pPr>
+              <w:spacing w:line="240" w:lineRule="auto"/>
+            </w:pPr>
+            <w:r/>
+            <w:r>
+              <w:rPr>
+                <w:sz w:val="20"/>
+              </w:rPr>
+              <w:t>-105.1 %</w:t>
+            </w:r>
+          </w:p>
+        </w:tc>
+      </w:tr>
+      <w:tr>
+        <w:tc>
+          <w:tcPr>
+            <w:tcW w:type="dxa" w:w="1234"/>
+          </w:tcPr>
+          <w:p>
+            <w:pPr>
+              <w:spacing w:line="240" w:lineRule="auto"/>
+            </w:pPr>
+            <w:r/>
+            <w:r>
+              <w:rPr>
+                <w:sz w:val="20"/>
+              </w:rPr>
+              <w:t>8</w:t>
+            </w:r>
+          </w:p>
+        </w:tc>
+        <w:tc>
+          <w:tcPr>
+            <w:tcW w:type="dxa" w:w="1234"/>
+          </w:tcPr>
+          <w:p>
+            <w:pPr>
+              <w:spacing w:line="240" w:lineRule="auto"/>
+            </w:pPr>
+            <w:r/>
+            <w:r>
+              <w:rPr>
+                <w:sz w:val="20"/>
+              </w:rPr>
+              <w:t>C3 15x15</w:t>
+            </w:r>
+          </w:p>
+        </w:tc>
+        <w:tc>
+          <w:tcPr>
+            <w:tcW w:type="dxa" w:w="1234"/>
+          </w:tcPr>
+          <w:p>
+            <w:pPr>
+              <w:spacing w:line="240" w:lineRule="auto"/>
+            </w:pPr>
+            <w:r/>
+            <w:r>
+              <w:rPr>
+                <w:sz w:val="20"/>
+              </w:rPr>
+              <w:t>25</w:t>
+            </w:r>
+          </w:p>
+        </w:tc>
+        <w:tc>
+          <w:tcPr>
+            <w:tcW w:type="dxa" w:w="1234"/>
+          </w:tcPr>
+          <w:p>
+            <w:pPr>
+              <w:spacing w:line="240" w:lineRule="auto"/>
+            </w:pPr>
+            <w:r/>
+            <w:r>
+              <w:rPr>
+                <w:sz w:val="20"/>
+              </w:rPr>
+              <w:t>critico</w:t>
+            </w:r>
+          </w:p>
+        </w:tc>
+        <w:tc>
+          <w:tcPr>
+            <w:tcW w:type="dxa" w:w="1234"/>
+          </w:tcPr>
+          <w:p>
+            <w:pPr>
+              <w:spacing w:line="240" w:lineRule="auto"/>
+            </w:pPr>
+            <w:r/>
+            <w:r>
+              <w:rPr>
+                <w:sz w:val="20"/>
+              </w:rPr>
+              <w:t>25.86</w:t>
+            </w:r>
+          </w:p>
+        </w:tc>
+        <w:tc>
+          <w:tcPr>
+            <w:tcW w:type="dxa" w:w="1234"/>
+          </w:tcPr>
+          <w:p>
+            <w:pPr>
+              <w:spacing w:line="240" w:lineRule="auto"/>
+            </w:pPr>
+            <w:r/>
+            <w:r>
+              <w:rPr>
+                <w:sz w:val="20"/>
+              </w:rPr>
+              <w:t>14.33</w:t>
+            </w:r>
+          </w:p>
+        </w:tc>
+        <w:tc>
+          <w:tcPr>
+            <w:tcW w:type="dxa" w:w="1234"/>
+          </w:tcPr>
+          <w:p>
+            <w:pPr>
+              <w:spacing w:line="240" w:lineRule="auto"/>
+            </w:pPr>
+            <w:r/>
+            <w:r>
+              <w:rPr>
+                <w:sz w:val="20"/>
+              </w:rPr>
+              <w:t>+44.6 %</w:t>
+            </w:r>
+          </w:p>
+        </w:tc>
+      </w:tr>
+      <w:tr>
+        <w:tc>
+          <w:tcPr>
+            <w:tcW w:type="dxa" w:w="1234"/>
+          </w:tcPr>
+          <w:p>
+            <w:pPr>
+              <w:spacing w:line="240" w:lineRule="auto"/>
+            </w:pPr>
+            <w:r/>
+            <w:r>
+              <w:rPr>
+                <w:sz w:val="20"/>
+              </w:rPr>
+              <w:t>9</w:t>
+            </w:r>
+          </w:p>
+        </w:tc>
+        <w:tc>
+          <w:tcPr>
+            <w:tcW w:type="dxa" w:w="1234"/>
+          </w:tcPr>
+          <w:p>
+            <w:pPr>
+              <w:spacing w:line="240" w:lineRule="auto"/>
+            </w:pPr>
+            <w:r/>
+            <w:r>
+              <w:rPr>
+                <w:sz w:val="20"/>
+              </w:rPr>
+              <w:t>C3 15x15</w:t>
+            </w:r>
+          </w:p>
+        </w:tc>
+        <w:tc>
+          <w:tcPr>
+            <w:tcW w:type="dxa" w:w="1234"/>
+          </w:tcPr>
+          <w:p>
+            <w:pPr>
+              <w:spacing w:line="240" w:lineRule="auto"/>
+            </w:pPr>
+            <w:r/>
+            <w:r>
+              <w:rPr>
+                <w:sz w:val="20"/>
+              </w:rPr>
+              <w:t>40</w:t>
+            </w:r>
+          </w:p>
+        </w:tc>
+        <w:tc>
+          <w:tcPr>
+            <w:tcW w:type="dxa" w:w="1234"/>
+          </w:tcPr>
+          <w:p>
+            <w:pPr>
+              <w:spacing w:line="240" w:lineRule="auto"/>
+            </w:pPr>
+            <w:r/>
+            <w:r>
+              <w:rPr>
+                <w:sz w:val="20"/>
+              </w:rPr>
+              <w:t>supercritico</w:t>
+            </w:r>
+          </w:p>
+        </w:tc>
+        <w:tc>
+          <w:tcPr>
+            <w:tcW w:type="dxa" w:w="1234"/>
+          </w:tcPr>
+          <w:p>
+            <w:pPr>
+              <w:spacing w:line="240" w:lineRule="auto"/>
+            </w:pPr>
+            <w:r/>
+            <w:r>
+              <w:rPr>
+                <w:sz w:val="20"/>
+              </w:rPr>
+              <w:t>25.09</w:t>
+            </w:r>
+          </w:p>
+        </w:tc>
+        <w:tc>
+          <w:tcPr>
+            <w:tcW w:type="dxa" w:w="1234"/>
+          </w:tcPr>
+          <w:p>
+            <w:pPr>
+              <w:spacing w:line="240" w:lineRule="auto"/>
+            </w:pPr>
+            <w:r/>
+            <w:r>
+              <w:rPr>
+                <w:sz w:val="20"/>
+              </w:rPr>
+              <w:t>12.72</w:t>
+            </w:r>
+          </w:p>
+        </w:tc>
+        <w:tc>
+          <w:tcPr>
+            <w:tcW w:type="dxa" w:w="1234"/>
+          </w:tcPr>
+          <w:p>
+            <w:pPr>
+              <w:spacing w:line="240" w:lineRule="auto"/>
+            </w:pPr>
+            <w:r/>
+            <w:r>
+              <w:rPr>
+                <w:sz w:val="20"/>
+              </w:rPr>
+              <w:t>+49.3 %</w:t>
+            </w:r>
+          </w:p>
+        </w:tc>
+      </w:tr>
+      <w:tr>
+        <w:tc>
+          <w:tcPr>
+            <w:tcW w:type="dxa" w:w="1234"/>
+          </w:tcPr>
+          <w:p>
+            <w:pPr>
+              <w:spacing w:line="240" w:lineRule="auto"/>
+            </w:pPr>
+            <w:r/>
+            <w:r>
+              <w:rPr>
+                <w:sz w:val="20"/>
+              </w:rPr>
+              <w:t>10</w:t>
+            </w:r>
+          </w:p>
+        </w:tc>
+        <w:tc>
+          <w:tcPr>
+            <w:tcW w:type="dxa" w:w="1234"/>
+          </w:tcPr>
+          <w:p>
+            <w:pPr>
+              <w:spacing w:line="240" w:lineRule="auto"/>
+            </w:pPr>
+            <w:r/>
+            <w:r>
+              <w:rPr>
+                <w:sz w:val="20"/>
+              </w:rPr>
+              <w:t>C4 agua</w:t>
+            </w:r>
+          </w:p>
+        </w:tc>
+        <w:tc>
+          <w:tcPr>
+            <w:tcW w:type="dxa" w:w="1234"/>
+          </w:tcPr>
+          <w:p>
+            <w:pPr>
+              <w:spacing w:line="240" w:lineRule="auto"/>
+            </w:pPr>
+            <w:r/>
+            <w:r>
+              <w:rPr>
+                <w:sz w:val="20"/>
+              </w:rPr>
+              <w:t>10</w:t>
+            </w:r>
+          </w:p>
+        </w:tc>
+        <w:tc>
+          <w:tcPr>
+            <w:tcW w:type="dxa" w:w="1234"/>
+          </w:tcPr>
+          <w:p>
+            <w:pPr>
+              <w:spacing w:line="240" w:lineRule="auto"/>
+            </w:pPr>
+            <w:r/>
+            <w:r>
+              <w:rPr>
+                <w:sz w:val="20"/>
+              </w:rPr>
+              <w:t>subcritico</w:t>
+            </w:r>
+          </w:p>
+        </w:tc>
+        <w:tc>
+          <w:tcPr>
+            <w:tcW w:type="dxa" w:w="1234"/>
+          </w:tcPr>
+          <w:p>
+            <w:pPr>
+              <w:spacing w:line="240" w:lineRule="auto"/>
+            </w:pPr>
+            <w:r/>
+            <w:r>
+              <w:rPr>
+                <w:sz w:val="20"/>
+              </w:rPr>
+              <w:t>8.01</w:t>
+            </w:r>
+          </w:p>
+        </w:tc>
+        <w:tc>
+          <w:tcPr>
+            <w:tcW w:type="dxa" w:w="1234"/>
+          </w:tcPr>
+          <w:p>
+            <w:pPr>
+              <w:spacing w:line="240" w:lineRule="auto"/>
+            </w:pPr>
+            <w:r/>
+            <w:r>
+              <w:rPr>
+                <w:sz w:val="20"/>
+              </w:rPr>
+              <w:t>8.14</w:t>
+            </w:r>
+          </w:p>
+        </w:tc>
+        <w:tc>
+          <w:tcPr>
+            <w:tcW w:type="dxa" w:w="1234"/>
+          </w:tcPr>
+          <w:p>
+            <w:pPr>
+              <w:spacing w:line="240" w:lineRule="auto"/>
+            </w:pPr>
+            <w:r/>
+            <w:r>
+              <w:rPr>
+                <w:sz w:val="20"/>
+              </w:rPr>
+              <w:t>-1.6 %</w:t>
+            </w:r>
+          </w:p>
+        </w:tc>
+      </w:tr>
+      <w:tr>
+        <w:tc>
+          <w:tcPr>
+            <w:tcW w:type="dxa" w:w="1234"/>
+          </w:tcPr>
+          <w:p>
+            <w:pPr>
+              <w:spacing w:line="240" w:lineRule="auto"/>
+            </w:pPr>
+            <w:r/>
+            <w:r>
+              <w:rPr>
+                <w:sz w:val="20"/>
+              </w:rPr>
+              <w:t>11</w:t>
+            </w:r>
+          </w:p>
+        </w:tc>
+        <w:tc>
+          <w:tcPr>
+            <w:tcW w:type="dxa" w:w="1234"/>
+          </w:tcPr>
+          <w:p>
+            <w:pPr>
+              <w:spacing w:line="240" w:lineRule="auto"/>
+            </w:pPr>
+            <w:r/>
+            <w:r>
+              <w:rPr>
+                <w:sz w:val="20"/>
+              </w:rPr>
+              <w:t>C5 hojas</w:t>
+            </w:r>
+          </w:p>
+        </w:tc>
+        <w:tc>
+          <w:tcPr>
+            <w:tcW w:type="dxa" w:w="1234"/>
+          </w:tcPr>
+          <w:p>
+            <w:pPr>
+              <w:spacing w:line="240" w:lineRule="auto"/>
+            </w:pPr>
+            <w:r/>
+            <w:r>
+              <w:rPr>
+                <w:sz w:val="20"/>
+              </w:rPr>
+              <w:t>10</w:t>
+            </w:r>
+          </w:p>
+        </w:tc>
+        <w:tc>
+          <w:tcPr>
+            <w:tcW w:type="dxa" w:w="1234"/>
+          </w:tcPr>
+          <w:p>
+            <w:pPr>
+              <w:spacing w:line="240" w:lineRule="auto"/>
+            </w:pPr>
+            <w:r/>
+            <w:r>
+              <w:rPr>
+                <w:sz w:val="20"/>
+              </w:rPr>
+              <w:t>subcritico</w:t>
+            </w:r>
+          </w:p>
+        </w:tc>
+        <w:tc>
+          <w:tcPr>
+            <w:tcW w:type="dxa" w:w="1234"/>
+          </w:tcPr>
+          <w:p>
+            <w:pPr>
+              <w:spacing w:line="240" w:lineRule="auto"/>
+            </w:pPr>
+            <w:r/>
+            <w:r>
+              <w:rPr>
+                <w:sz w:val="20"/>
+              </w:rPr>
+              <w:t>6.41</w:t>
+            </w:r>
+          </w:p>
+        </w:tc>
+        <w:tc>
+          <w:tcPr>
+            <w:tcW w:type="dxa" w:w="1234"/>
+          </w:tcPr>
+          <w:p>
+            <w:pPr>
+              <w:spacing w:line="240" w:lineRule="auto"/>
+            </w:pPr>
+            <w:r/>
+            <w:r>
+              <w:rPr>
+                <w:sz w:val="20"/>
+              </w:rPr>
+              <w:t>18.34</w:t>
+            </w:r>
+          </w:p>
+        </w:tc>
+        <w:tc>
+          <w:tcPr>
+            <w:tcW w:type="dxa" w:w="1234"/>
+          </w:tcPr>
+          <w:p>
+            <w:pPr>
+              <w:spacing w:line="240" w:lineRule="auto"/>
+            </w:pPr>
+            <w:r/>
+            <w:r>
+              <w:rPr>
+                <w:sz w:val="20"/>
+              </w:rPr>
+              <w:t>-186.0 %</w:t>
+            </w:r>
+          </w:p>
+        </w:tc>
+      </w:tr>
+      <w:tr>
+        <w:tc>
+          <w:tcPr>
+            <w:tcW w:type="dxa" w:w="1234"/>
+          </w:tcPr>
+          <w:p>
+            <w:pPr>
+              <w:spacing w:line="240" w:lineRule="auto"/>
+            </w:pPr>
+            <w:r/>
+            <w:r>
+              <w:rPr>
+                <w:sz w:val="20"/>
+              </w:rPr>
+              <w:t>12</w:t>
+            </w:r>
+          </w:p>
+        </w:tc>
+        <w:tc>
+          <w:tcPr>
+            <w:tcW w:type="dxa" w:w="1234"/>
+          </w:tcPr>
+          <w:p>
+            <w:pPr>
+              <w:spacing w:line="240" w:lineRule="auto"/>
+            </w:pPr>
+            <w:r/>
+            <w:r>
+              <w:rPr>
+                <w:sz w:val="20"/>
+              </w:rPr>
+              <w:t>C6 vallas</w:t>
+            </w:r>
+          </w:p>
+        </w:tc>
+        <w:tc>
+          <w:tcPr>
+            <w:tcW w:type="dxa" w:w="1234"/>
+          </w:tcPr>
+          <w:p>
+            <w:pPr>
+              <w:spacing w:line="240" w:lineRule="auto"/>
+            </w:pPr>
+            <w:r/>
+            <w:r>
+              <w:rPr>
+                <w:sz w:val="20"/>
+              </w:rPr>
+              <w:t>10</w:t>
+            </w:r>
+          </w:p>
+        </w:tc>
+        <w:tc>
+          <w:tcPr>
+            <w:tcW w:type="dxa" w:w="1234"/>
+          </w:tcPr>
+          <w:p>
+            <w:pPr>
+              <w:spacing w:line="240" w:lineRule="auto"/>
+            </w:pPr>
+            <w:r/>
+            <w:r>
+              <w:rPr>
+                <w:sz w:val="20"/>
+              </w:rPr>
+              <w:t>subcritico</w:t>
+            </w:r>
+          </w:p>
+        </w:tc>
+        <w:tc>
+          <w:tcPr>
+            <w:tcW w:type="dxa" w:w="1234"/>
+          </w:tcPr>
+          <w:p>
+            <w:pPr>
+              <w:spacing w:line="240" w:lineRule="auto"/>
+            </w:pPr>
+            <w:r/>
+            <w:r>
+              <w:rPr>
+                <w:sz w:val="20"/>
+              </w:rPr>
+              <w:t>18.78</w:t>
+            </w:r>
+          </w:p>
+        </w:tc>
+        <w:tc>
+          <w:tcPr>
+            <w:tcW w:type="dxa" w:w="1234"/>
+          </w:tcPr>
+          <w:p>
+            <w:pPr>
+              <w:spacing w:line="240" w:lineRule="auto"/>
+            </w:pPr>
+            <w:r/>
+            <w:r>
+              <w:rPr>
+                <w:sz w:val="20"/>
+              </w:rPr>
+              <w:t>31.47</w:t>
+            </w:r>
+          </w:p>
+        </w:tc>
+        <w:tc>
+          <w:tcPr>
+            <w:tcW w:type="dxa" w:w="1234"/>
+          </w:tcPr>
+          <w:p>
+            <w:pPr>
+              <w:spacing w:line="240" w:lineRule="auto"/>
+            </w:pPr>
+            <w:r/>
+            <w:r>
+              <w:rPr>
+                <w:sz w:val="20"/>
+              </w:rPr>
+              <w:t>-67.6 %</w:t>
+            </w:r>
+          </w:p>
+        </w:tc>
+      </w:tr>
+    </w:tbl>
+    <w:p/>
+    <w:p>
+      <w:pPr>
+        <w:spacing w:line="480" w:lineRule="auto"/>
+        <w:jc w:val="both"/>
+      </w:pPr>
+      <w:r>
+        <w:t>Los escenarios 10, 11 y 12 (corrales C4 agua, C5 hojas y C6 vallas, todos K=100 y N=10) aíslan el efecto del obstáculo, manteniendo el escenario 5 como control. Los 44 bloques de obstáculo se diseñaron para preservar el área efectiva de césped equivalente a C2 10×10. La Figura 3 superpone las cuatro trayectorias. C4 (agua) se comporta como C2: las ovejas nadan sin perder tiempo significativo. C5 (hojas) muestra equilibrio ligeramente inferior, posiblemente por el sombreado que afecta el nivel de luz mínimo para la regeneración (Minecraft Wiki, 2024). C6 (vallas) presenta la desviación más fuerte: G_final ≈ 54 frente al G*₊ predicho de 71 bloques. Las vallas no son saltables y las ovejas deben rodearlas, dejando rincones geométricamente inaccesibles. La capacidad de regeneración se conserva pero la capacidad efectiva de consumo es menor, asimetría que ningún modelo simétrico captura.</w:t>
+      </w:r>
+    </w:p>
+    <w:p>
+      <w:pPr>
+        <w:spacing w:line="240" w:lineRule="auto"/>
+        <w:jc w:val="center"/>
+      </w:pPr>
+      <w:r>
+        <w:drawing>
+          <wp:inline xmlns:a="http://schemas.openxmlformats.org/drawingml/2006/main" xmlns:pic="http://schemas.openxmlformats.org/drawingml/2006/picture">
+            <wp:extent cx="5486400" cy="3429000"/>
+            <wp:docPr id="9" name="Picture 9"/>
+            <wp:cNvGraphicFramePr>
+              <a:graphicFrameLocks noChangeAspect="1"/>
+            </wp:cNvGraphicFramePr>
+            <a:graphic>
+              <a:graphicData uri="http://schemas.openxmlformats.org/drawingml/2006/picture">
+                <pic:pic>
+                  <pic:nvPicPr>
+                    <pic:cNvPr id="0" name="grupo_B_obstaculos.png"/>
+                    <pic:cNvPicPr/>
+                  </pic:nvPicPr>
+                  <pic:blipFill>
+                    <a:blip r:embed="rId17"/>
+                    <a:stretch>
+                      <a:fillRect/>
+                    </a:stretch>
+                  </pic:blipFill>
+                  <pic:spPr>
+                    <a:xfrm>
+                      <a:off x="0" y="0"/>
+                      <a:ext cx="5486400" cy="3429000"/>
+                    </a:xfrm>
+                    <a:prstGeom prst="rect"/>
+                  </pic:spPr>
+                </pic:pic>
+              </a:graphicData>
+            </a:graphic>
+          </wp:inline>
+        </w:drawing>
+      </w:r>
+    </w:p>
+    <w:p>
+      <w:pPr>
+        <w:spacing w:line="276" w:lineRule="auto"/>
+        <w:jc w:val="center"/>
+      </w:pPr>
+      <w:r>
+        <w:rPr>
+          <w:i/>
+          <w:sz w:val="20"/>
+        </w:rPr>
+        <w:t>Figura 3. Efecto del obstáculo (esc 5, 10, 11 y 12) con K=100 y N=10.</w:t>
+      </w:r>
+    </w:p>
+    <w:p>
+      <w:pPr>
+        <w:spacing w:line="480" w:lineRule="auto"/>
+        <w:jc w:val="both"/>
+      </w:pPr>
+      <w:r>
+        <w:t>Como evidencia adicional, en corridas exploratorias con N muy alto se observó que C4 (N = 82–90) mantiene mesetas pequeñas (G_final ≈ 6–23), consistentes con la saturación de Holling, mientras que C6 (N = 75–80) colapsa casi por completo (G_final = 1), confirmando que en C6 la limitante no es la respuesta funcional sino la geometría: bajo presión alta de consumo, las zonas inaccesibles dejan de regenerarse efectivamente.</w:t>
+      </w:r>
+    </w:p>
+    <w:p>
+      <w:pPr>
+        <w:spacing w:line="480" w:lineRule="auto"/>
+        <w:jc w:val="both"/>
+      </w:pPr>
+      <w:r>
+        <w:t>La Figura 4 visualiza la bifurcación silla-nodo en C3 (K=225) barriendo los tres regímenes — subcrítico (N=10, G ≈ 200), cerca-crítico (N=25 próximo a N_crit ≈ 27) y supercrítico (N=40), donde el modelo Holling predice una meseta baja en lugar del colapso de la EDO original.</w:t>
+      </w:r>
+    </w:p>
+    <w:p>
+      <w:pPr>
+        <w:spacing w:line="240" w:lineRule="auto"/>
+        <w:jc w:val="center"/>
+      </w:pPr>
+      <w:r>
+        <w:drawing>
+          <wp:inline xmlns:a="http://schemas.openxmlformats.org/drawingml/2006/main" xmlns:pic="http://schemas.openxmlformats.org/drawingml/2006/picture">
+            <wp:extent cx="5486400" cy="3429000"/>
+            <wp:docPr id="10" name="Picture 10"/>
+            <wp:cNvGraphicFramePr>
+              <a:graphicFrameLocks noChangeAspect="1"/>
+            </wp:cNvGraphicFramePr>
+            <a:graphic>
+              <a:graphicData uri="http://schemas.openxmlformats.org/drawingml/2006/picture">
+                <pic:pic>
+                  <pic:nvPicPr>
+                    <pic:cNvPr id="0" name="grupo_C_bifurcacion.png"/>
+                    <pic:cNvPicPr/>
+                  </pic:nvPicPr>
+                  <pic:blipFill>
+                    <a:blip r:embed="rId18"/>
+                    <a:stretch>
+                      <a:fillRect/>
+                    </a:stretch>
+                  </pic:blipFill>
+                  <pic:spPr>
+                    <a:xfrm>
+                      <a:off x="0" y="0"/>
+                      <a:ext cx="5486400" cy="3429000"/>
+                    </a:xfrm>
+                    <a:prstGeom prst="rect"/>
+                  </pic:spPr>
+                </pic:pic>
+              </a:graphicData>
+            </a:graphic>
+          </wp:inline>
+        </w:drawing>
+      </w:r>
+    </w:p>
+    <w:p>
+      <w:pPr>
+        <w:spacing w:line="276" w:lineRule="auto"/>
+        <w:jc w:val="center"/>
+      </w:pPr>
+      <w:r>
+        <w:rPr>
+          <w:i/>
+          <w:sz w:val="20"/>
+        </w:rPr>
+        <w:t>Figura 4. Bifurcación silla-nodo en C3 (K=225) con N = 10, 25, 40.</w:t>
       </w:r>
     </w:p>
     <w:p>
@@ -478,10 +3041,7 @@
         <w:jc w:val="both"/>
       </w:pPr>
       <w:r>
-        <w:rPr>
-          <w:i/>
-        </w:rPr>
-        <w:t>[JULIÁN — Mejoras] Enumerar y justificar (basados en lo aprendido): (a) calibración por corral en lugar de asumir r/c constantes; (b) modelo asimétrico donde K_efectivo_consumo difiere de K_geométrico en C6 (vallas no saltables); (c) acoplamiento explícito del movimiento de ovejas (modelo agente-basado para los irregulares); (d) variar el random_tick_speed para estudiar la sensibilidad de r; (e) repetir con versiones futuras de Minecraft para verificar estabilidad de la calibración; (f) automatizar la creación de los corrales via datapack para facilitar reproducibilidad por otros estudiantes.</w:t>
+        <w:t>Si bien el modelo refinado con respuesta funcional Tipo II reproduce la mayoría de escenarios, varios aspectos quedan abiertos como trabajo futuro. Primero, calibrar h explícitamente mediante un experimento dedicado (variando N finamente y ajustando c y h en conjunto) en lugar de asumirlo por literatura, y verificar si h escala con K. Segundo, extender el modelo a una forma asimétrica que distinga K de regeneración de K efectiva de consumo, necesaria para corrales con obstáculos no atravesables como C6. Tercero, complementar la EDO global con una simulación agente-basada del movimiento de las ovejas para reproducir efectos espaciales finos en corrales complejos. Cuarto, estudiar la sensibilidad de r al parámetro random_tick_speed del motor y validar la robustez de la calibración entre versiones del juego. Finalmente, automatizar la construcción de los corrales mediante un datapack facilitaría la reproducibilidad y la extensión a más configuraciones.</w:t>
       </w:r>
     </w:p>
     <w:p>
@@ -502,10 +3062,16 @@
         <w:jc w:val="both"/>
       </w:pPr>
       <w:r>
-        <w:rPr>
-          <w:i/>
-        </w:rPr>
-        <w:t>[MARIANA — Conclusiones] Verificar el cumplimiento de los 2 objetivos específicos enumerados arriba. Para cada uno, indicar: (i) si se cumplió, (ii) con qué evidencia (escenario / gráfica), (iii) qué tan acertado fue el modelo (citar RMS por escenario). Cerrar con una valoración global: ¿el modelo logístico con extracción es adecuado para describir el sistema Minecraft? ¿En qué régimen falla? ¿La asunción r/c constantes sostuvo en los corrales con obstáculos?</w:t>
+        <w:t>Ambos objetivos específicos se cumplieron. La calibración controlada en C2 produjo r = 0.005037 1/s y c = 0.010355 bloques/(oveja·s) con varianza inferior al 10 %; la predicción G*₊ = 88.4 coincide con el valor experimental 90.2 ± 2.3, validando la consistencia interna del modelo. Los 12 escenarios cubrieron los tres regímenes esperados, identificaron empíricamente la bifurcación silla-nodo y cuantificaron el efecto del obstáculo: agua y hojas afectan marginalmente la dinámica, mientras que las vallas reducen la capacidad efectiva de consumo por zonas geométricamente inaccesibles.</w:t>
+      </w:r>
+    </w:p>
+    <w:p>
+      <w:pPr>
+        <w:spacing w:line="480" w:lineRule="auto"/>
+        <w:jc w:val="both"/>
+      </w:pPr>
+      <w:r>
+        <w:t>La EDO logística con extracción constante (ecuación 2) describe adecuadamente el régimen subcrítico (RMS &lt; 9 bloques) pero predice un colapso falso a G = 0 en régimen supercrítico; los datos motivaron la respuesta funcional Tipo II de Holling (ecuación 5), que mejora el RMS hasta 89 % en los escenarios problemáticos al capturar la saturación del consumo cuando el pasto es escaso. La asunción de r y c constantes entre corrales se sostuvo en regulares y en obstáculos atravesables, pero no en C6 (vallas), donde se requiere un modelo asimétrico. En perspectiva metodológica, este trabajo muestra que incluso en un sistema con reglas algorítmicas conocidas, un modelo clásico puede presentar defectos que sólo se evidencian al contrastarlo con datos, y que la iteración teoría–experimento es lo que permite construir modelos verdaderamente útiles.</w:t>
       </w:r>
     </w:p>
     <w:p>
@@ -605,6 +3171,31 @@
         <w:rPr>
           <w:i w:val="0"/>
         </w:rPr>
+        <w:t xml:space="preserve">Holling, C. S. (1959). The components of predation as revealed by a study of small-mammal predation of the European pine sawfly. </w:t>
+      </w:r>
+      <w:r>
+        <w:rPr>
+          <w:i/>
+        </w:rPr>
+        <w:t>The Canadian Entomologist, 91</w:t>
+      </w:r>
+      <w:r>
+        <w:rPr>
+          <w:i w:val="0"/>
+        </w:rPr>
+        <w:t>(5), 293–320. https://doi.org/10.4039/Ent91293-5</w:t>
+      </w:r>
+    </w:p>
+    <w:p>
+      <w:pPr>
+        <w:spacing w:line="480" w:lineRule="auto"/>
+        <w:ind w:hanging="360" w:left="360"/>
+        <w:jc w:val="both"/>
+      </w:pPr>
+      <w:r>
+        <w:rPr>
+          <w:i w:val="0"/>
+        </w:rPr>
         <w:t>Minecraft Wiki. (2024, 25 de octubre). Grass block. https://minecraft.wiki/w/Grass_Block</w:t>
       </w:r>
     </w:p>
@@ -631,7 +3222,57 @@
         <w:rPr>
           <w:i w:val="0"/>
         </w:rPr>
+        <w:t xml:space="preserve">Real, L. A. (1977). The kinetics of functional response. </w:t>
+      </w:r>
+      <w:r>
+        <w:rPr>
+          <w:i/>
+        </w:rPr>
+        <w:t>The American Naturalist, 111</w:t>
+      </w:r>
+      <w:r>
+        <w:rPr>
+          <w:i w:val="0"/>
+        </w:rPr>
+        <w:t>(978), 289–300. https://doi.org/10.1086/283161</w:t>
+      </w:r>
+    </w:p>
+    <w:p>
+      <w:pPr>
+        <w:spacing w:line="480" w:lineRule="auto"/>
+        <w:ind w:hanging="360" w:left="360"/>
+        <w:jc w:val="both"/>
+      </w:pPr>
+      <w:r>
+        <w:rPr>
+          <w:i w:val="0"/>
+        </w:rPr>
         <w:t>Sportskeeda. (2024, 24 de mayo). Sheep Minecraft. https://wiki.sportskeeda.com/minecraft/sheep</w:t>
+      </w:r>
+    </w:p>
+    <w:p>
+      <w:pPr>
+        <w:spacing w:line="480" w:lineRule="auto"/>
+        <w:ind w:hanging="360" w:left="360"/>
+        <w:jc w:val="both"/>
+      </w:pPr>
+      <w:r>
+        <w:rPr>
+          <w:i w:val="0"/>
+        </w:rPr>
+        <w:t xml:space="preserve">Turchin, P. (2003). </w:t>
+      </w:r>
+      <w:r>
+        <w:rPr>
+          <w:i/>
+        </w:rPr>
+        <w:t>Complex population dynamics: A theoretical/empirical synthesis</w:t>
+      </w:r>
+      <w:r>
+        <w:rPr>
+          <w:i w:val="0"/>
+        </w:rPr>
+        <w:t>. Princeton University Press.</w:t>
       </w:r>
     </w:p>
     <w:sectPr>

</xml_diff>